<commit_message>
Se agregaron campos al formulario de informe tecnico y se agregaron a los tempaltes PDF y WORD. Ademas se agrego un campo de Numero de convenio en las Admisiones. Se soluciono para que guarde creado_por y modificado_por en la carga de archivos de la admision.  Se arreglo la vista del listado de convenios en el detalle del comedor
</commit_message>
<xml_diff>
--- a/admisiones/templates/admisiones/docx/renovacion_docx_informe_tecnico_base.docx
+++ b/admisiones/templates/admisiones/docx/renovacion_docx_informe_tecnico_base.docx
@@ -2433,7 +2433,23 @@
                 <w:sz w:val="22"/>
                 <w:szCs w:val="22"/>
               </w:rPr>
-              <w:t>informe.aprobadas_desayuno_lunes</w:t>
+              <w:t>informe.aprobadas</w:t>
+            </w:r>
+            <w:r>
+              <w:rPr>
+                <w:rFonts w:ascii="Arial" w:hAnsi="Arial" w:cs="Arial"/>
+                <w:sz w:val="22"/>
+                <w:szCs w:val="22"/>
+              </w:rPr>
+              <w:t>_ultimo_convenio</w:t>
+            </w:r>
+            <w:r>
+              <w:rPr>
+                <w:rFonts w:ascii="Arial" w:hAnsi="Arial" w:cs="Arial"/>
+                <w:sz w:val="22"/>
+                <w:szCs w:val="22"/>
+              </w:rPr>
+              <w:t>_desayuno_lunes</w:t>
             </w:r>
             <w:proofErr w:type="spellEnd"/>
             <w:r>
@@ -2477,7 +2493,49 @@
                 <w:sz w:val="22"/>
                 <w:szCs w:val="22"/>
               </w:rPr>
-              <w:t>informe.aprobadas_almuerzo_lunes</w:t>
+              <w:t>informe.aprobadas</w:t>
+            </w:r>
+            <w:proofErr w:type="spellEnd"/>
+            <w:r>
+              <w:rPr>
+                <w:rFonts w:ascii="Arial" w:hAnsi="Arial" w:cs="Arial"/>
+                <w:sz w:val="22"/>
+                <w:szCs w:val="22"/>
+              </w:rPr>
+              <w:t>_</w:t>
+            </w:r>
+            <w:r>
+              <w:rPr>
+                <w:rFonts w:ascii="Arial" w:hAnsi="Arial" w:cs="Arial"/>
+                <w:sz w:val="22"/>
+                <w:szCs w:val="22"/>
+              </w:rPr>
+              <w:t xml:space="preserve"> </w:t>
+            </w:r>
+            <w:proofErr w:type="spellStart"/>
+            <w:r>
+              <w:rPr>
+                <w:rFonts w:ascii="Arial" w:hAnsi="Arial" w:cs="Arial"/>
+                <w:sz w:val="22"/>
+                <w:szCs w:val="22"/>
+              </w:rPr>
+              <w:t>ultimo_convenio</w:t>
+            </w:r>
+            <w:r>
+              <w:rPr>
+                <w:rFonts w:ascii="Arial" w:hAnsi="Arial" w:cs="Arial"/>
+                <w:sz w:val="22"/>
+                <w:szCs w:val="22"/>
+              </w:rPr>
+              <w:t>_</w:t>
+            </w:r>
+            <w:r>
+              <w:rPr>
+                <w:rFonts w:ascii="Arial" w:hAnsi="Arial" w:cs="Arial"/>
+                <w:sz w:val="22"/>
+                <w:szCs w:val="22"/>
+              </w:rPr>
+              <w:t>almuerzo_lunes</w:t>
             </w:r>
             <w:proofErr w:type="spellEnd"/>
             <w:r>
@@ -2521,7 +2579,49 @@
                 <w:sz w:val="22"/>
                 <w:szCs w:val="22"/>
               </w:rPr>
-              <w:t>informe.aprobadas_merienda_lunes</w:t>
+              <w:t>informe.aprobadas</w:t>
+            </w:r>
+            <w:proofErr w:type="spellEnd"/>
+            <w:r>
+              <w:rPr>
+                <w:rFonts w:ascii="Arial" w:hAnsi="Arial" w:cs="Arial"/>
+                <w:sz w:val="22"/>
+                <w:szCs w:val="22"/>
+              </w:rPr>
+              <w:t>_</w:t>
+            </w:r>
+            <w:r>
+              <w:rPr>
+                <w:rFonts w:ascii="Arial" w:hAnsi="Arial" w:cs="Arial"/>
+                <w:sz w:val="22"/>
+                <w:szCs w:val="22"/>
+              </w:rPr>
+              <w:t xml:space="preserve"> </w:t>
+            </w:r>
+            <w:proofErr w:type="spellStart"/>
+            <w:r>
+              <w:rPr>
+                <w:rFonts w:ascii="Arial" w:hAnsi="Arial" w:cs="Arial"/>
+                <w:sz w:val="22"/>
+                <w:szCs w:val="22"/>
+              </w:rPr>
+              <w:t>ultimo_convenio</w:t>
+            </w:r>
+            <w:r>
+              <w:rPr>
+                <w:rFonts w:ascii="Arial" w:hAnsi="Arial" w:cs="Arial"/>
+                <w:sz w:val="22"/>
+                <w:szCs w:val="22"/>
+              </w:rPr>
+              <w:t>_</w:t>
+            </w:r>
+            <w:r>
+              <w:rPr>
+                <w:rFonts w:ascii="Arial" w:hAnsi="Arial" w:cs="Arial"/>
+                <w:sz w:val="22"/>
+                <w:szCs w:val="22"/>
+              </w:rPr>
+              <w:t>merienda_lunes</w:t>
             </w:r>
             <w:proofErr w:type="spellEnd"/>
             <w:r>
@@ -2565,7 +2665,49 @@
                 <w:sz w:val="22"/>
                 <w:szCs w:val="22"/>
               </w:rPr>
-              <w:t>informe.aprobadas_cena_lunes</w:t>
+              <w:t>informe.aprobadas</w:t>
+            </w:r>
+            <w:proofErr w:type="spellEnd"/>
+            <w:r>
+              <w:rPr>
+                <w:rFonts w:ascii="Arial" w:hAnsi="Arial" w:cs="Arial"/>
+                <w:sz w:val="22"/>
+                <w:szCs w:val="22"/>
+              </w:rPr>
+              <w:t>_</w:t>
+            </w:r>
+            <w:r>
+              <w:rPr>
+                <w:rFonts w:ascii="Arial" w:hAnsi="Arial" w:cs="Arial"/>
+                <w:sz w:val="22"/>
+                <w:szCs w:val="22"/>
+              </w:rPr>
+              <w:t xml:space="preserve"> </w:t>
+            </w:r>
+            <w:proofErr w:type="spellStart"/>
+            <w:r>
+              <w:rPr>
+                <w:rFonts w:ascii="Arial" w:hAnsi="Arial" w:cs="Arial"/>
+                <w:sz w:val="22"/>
+                <w:szCs w:val="22"/>
+              </w:rPr>
+              <w:t>ultimo_convenio</w:t>
+            </w:r>
+            <w:r>
+              <w:rPr>
+                <w:rFonts w:ascii="Arial" w:hAnsi="Arial" w:cs="Arial"/>
+                <w:sz w:val="22"/>
+                <w:szCs w:val="22"/>
+              </w:rPr>
+              <w:t>_</w:t>
+            </w:r>
+            <w:r>
+              <w:rPr>
+                <w:rFonts w:ascii="Arial" w:hAnsi="Arial" w:cs="Arial"/>
+                <w:sz w:val="22"/>
+                <w:szCs w:val="22"/>
+              </w:rPr>
+              <w:t>cena_lunes</w:t>
             </w:r>
             <w:proofErr w:type="spellEnd"/>
             <w:r>
@@ -2639,7 +2781,50 @@
                 <w:sz w:val="22"/>
                 <w:szCs w:val="22"/>
               </w:rPr>
-              <w:t>informe.aprobadas_desayuno_martes</w:t>
+              <w:t>informe.aprobadas</w:t>
+            </w:r>
+            <w:proofErr w:type="spellEnd"/>
+            <w:r>
+              <w:rPr>
+                <w:rFonts w:ascii="Arial" w:hAnsi="Arial" w:cs="Arial"/>
+                <w:sz w:val="22"/>
+                <w:szCs w:val="22"/>
+              </w:rPr>
+              <w:t>_</w:t>
+            </w:r>
+            <w:r>
+              <w:rPr>
+                <w:rFonts w:ascii="Arial" w:hAnsi="Arial" w:cs="Arial"/>
+                <w:sz w:val="22"/>
+                <w:szCs w:val="22"/>
+              </w:rPr>
+              <w:t xml:space="preserve"> </w:t>
+            </w:r>
+            <w:proofErr w:type="spellStart"/>
+            <w:r>
+              <w:rPr>
+                <w:rFonts w:ascii="Arial" w:hAnsi="Arial" w:cs="Arial"/>
+                <w:sz w:val="22"/>
+                <w:szCs w:val="22"/>
+              </w:rPr>
+              <w:t>ultimo_convenio</w:t>
+            </w:r>
+            <w:r>
+              <w:rPr>
+                <w:rFonts w:ascii="Arial" w:hAnsi="Arial" w:cs="Arial"/>
+                <w:sz w:val="22"/>
+                <w:szCs w:val="22"/>
+              </w:rPr>
+              <w:lastRenderedPageBreak/>
+              <w:t>_</w:t>
+            </w:r>
+            <w:r>
+              <w:rPr>
+                <w:rFonts w:ascii="Arial" w:hAnsi="Arial" w:cs="Arial"/>
+                <w:sz w:val="22"/>
+                <w:szCs w:val="22"/>
+              </w:rPr>
+              <w:t>desayuno_martes</w:t>
             </w:r>
             <w:proofErr w:type="spellEnd"/>
             <w:r>
@@ -2674,6 +2859,7 @@
                 <w:sz w:val="22"/>
                 <w:szCs w:val="22"/>
               </w:rPr>
+              <w:lastRenderedPageBreak/>
               <w:t xml:space="preserve">{{ </w:t>
             </w:r>
             <w:proofErr w:type="spellStart"/>
@@ -2683,7 +2869,50 @@
                 <w:sz w:val="22"/>
                 <w:szCs w:val="22"/>
               </w:rPr>
-              <w:t>informe.aprobadas_almuerzo_martes</w:t>
+              <w:t>informe.aprobadas</w:t>
+            </w:r>
+            <w:proofErr w:type="spellEnd"/>
+            <w:r>
+              <w:rPr>
+                <w:rFonts w:ascii="Arial" w:hAnsi="Arial" w:cs="Arial"/>
+                <w:sz w:val="22"/>
+                <w:szCs w:val="22"/>
+              </w:rPr>
+              <w:t>_</w:t>
+            </w:r>
+            <w:r>
+              <w:rPr>
+                <w:rFonts w:ascii="Arial" w:hAnsi="Arial" w:cs="Arial"/>
+                <w:sz w:val="22"/>
+                <w:szCs w:val="22"/>
+              </w:rPr>
+              <w:t xml:space="preserve"> </w:t>
+            </w:r>
+            <w:proofErr w:type="spellStart"/>
+            <w:r>
+              <w:rPr>
+                <w:rFonts w:ascii="Arial" w:hAnsi="Arial" w:cs="Arial"/>
+                <w:sz w:val="22"/>
+                <w:szCs w:val="22"/>
+              </w:rPr>
+              <w:t>ultimo_convenio</w:t>
+            </w:r>
+            <w:r>
+              <w:rPr>
+                <w:rFonts w:ascii="Arial" w:hAnsi="Arial" w:cs="Arial"/>
+                <w:sz w:val="22"/>
+                <w:szCs w:val="22"/>
+              </w:rPr>
+              <w:lastRenderedPageBreak/>
+              <w:t>_</w:t>
+            </w:r>
+            <w:r>
+              <w:rPr>
+                <w:rFonts w:ascii="Arial" w:hAnsi="Arial" w:cs="Arial"/>
+                <w:sz w:val="22"/>
+                <w:szCs w:val="22"/>
+              </w:rPr>
+              <w:t>almuerzo_martes</w:t>
             </w:r>
             <w:proofErr w:type="spellEnd"/>
             <w:r>
@@ -2718,6 +2947,7 @@
                 <w:sz w:val="22"/>
                 <w:szCs w:val="22"/>
               </w:rPr>
+              <w:lastRenderedPageBreak/>
               <w:t xml:space="preserve">{{ </w:t>
             </w:r>
             <w:proofErr w:type="spellStart"/>
@@ -2727,7 +2957,50 @@
                 <w:sz w:val="22"/>
                 <w:szCs w:val="22"/>
               </w:rPr>
-              <w:t>informe.aprobadas_merienda_martes</w:t>
+              <w:t>informe.aprobadas</w:t>
+            </w:r>
+            <w:proofErr w:type="spellEnd"/>
+            <w:r>
+              <w:rPr>
+                <w:rFonts w:ascii="Arial" w:hAnsi="Arial" w:cs="Arial"/>
+                <w:sz w:val="22"/>
+                <w:szCs w:val="22"/>
+              </w:rPr>
+              <w:t>_</w:t>
+            </w:r>
+            <w:r>
+              <w:rPr>
+                <w:rFonts w:ascii="Arial" w:hAnsi="Arial" w:cs="Arial"/>
+                <w:sz w:val="22"/>
+                <w:szCs w:val="22"/>
+              </w:rPr>
+              <w:t xml:space="preserve"> </w:t>
+            </w:r>
+            <w:proofErr w:type="spellStart"/>
+            <w:r>
+              <w:rPr>
+                <w:rFonts w:ascii="Arial" w:hAnsi="Arial" w:cs="Arial"/>
+                <w:sz w:val="22"/>
+                <w:szCs w:val="22"/>
+              </w:rPr>
+              <w:t>ultimo_convenio</w:t>
+            </w:r>
+            <w:r>
+              <w:rPr>
+                <w:rFonts w:ascii="Arial" w:hAnsi="Arial" w:cs="Arial"/>
+                <w:sz w:val="22"/>
+                <w:szCs w:val="22"/>
+              </w:rPr>
+              <w:lastRenderedPageBreak/>
+              <w:t>_</w:t>
+            </w:r>
+            <w:r>
+              <w:rPr>
+                <w:rFonts w:ascii="Arial" w:hAnsi="Arial" w:cs="Arial"/>
+                <w:sz w:val="22"/>
+                <w:szCs w:val="22"/>
+              </w:rPr>
+              <w:t>merienda_martes</w:t>
             </w:r>
             <w:proofErr w:type="spellEnd"/>
             <w:r>
@@ -2762,6 +3035,7 @@
                 <w:sz w:val="22"/>
                 <w:szCs w:val="22"/>
               </w:rPr>
+              <w:lastRenderedPageBreak/>
               <w:t xml:space="preserve">{{ </w:t>
             </w:r>
             <w:proofErr w:type="spellStart"/>
@@ -2771,7 +3045,50 @@
                 <w:sz w:val="22"/>
                 <w:szCs w:val="22"/>
               </w:rPr>
-              <w:t>informe.aprobadas_cena_martes</w:t>
+              <w:t>informe.aprobadas</w:t>
+            </w:r>
+            <w:proofErr w:type="spellEnd"/>
+            <w:r>
+              <w:rPr>
+                <w:rFonts w:ascii="Arial" w:hAnsi="Arial" w:cs="Arial"/>
+                <w:sz w:val="22"/>
+                <w:szCs w:val="22"/>
+              </w:rPr>
+              <w:t>_</w:t>
+            </w:r>
+            <w:r>
+              <w:rPr>
+                <w:rFonts w:ascii="Arial" w:hAnsi="Arial" w:cs="Arial"/>
+                <w:sz w:val="22"/>
+                <w:szCs w:val="22"/>
+              </w:rPr>
+              <w:t xml:space="preserve"> </w:t>
+            </w:r>
+            <w:proofErr w:type="spellStart"/>
+            <w:r>
+              <w:rPr>
+                <w:rFonts w:ascii="Arial" w:hAnsi="Arial" w:cs="Arial"/>
+                <w:sz w:val="22"/>
+                <w:szCs w:val="22"/>
+              </w:rPr>
+              <w:lastRenderedPageBreak/>
+              <w:t>ultimo_convenio</w:t>
+            </w:r>
+            <w:r>
+              <w:rPr>
+                <w:rFonts w:ascii="Arial" w:hAnsi="Arial" w:cs="Arial"/>
+                <w:sz w:val="22"/>
+                <w:szCs w:val="22"/>
+              </w:rPr>
+              <w:t>_</w:t>
+            </w:r>
+            <w:r>
+              <w:rPr>
+                <w:rFonts w:ascii="Arial" w:hAnsi="Arial" w:cs="Arial"/>
+                <w:sz w:val="22"/>
+                <w:szCs w:val="22"/>
+              </w:rPr>
+              <w:t>cena_martes</w:t>
             </w:r>
             <w:proofErr w:type="spellEnd"/>
             <w:r>
@@ -2811,6 +3128,7 @@
                 <w:sz w:val="22"/>
                 <w:szCs w:val="22"/>
               </w:rPr>
+              <w:lastRenderedPageBreak/>
               <w:t>Miercoles</w:t>
             </w:r>
             <w:proofErr w:type="spellEnd"/>
@@ -2847,16 +3165,49 @@
                 <w:sz w:val="22"/>
                 <w:szCs w:val="22"/>
               </w:rPr>
-              <w:t>informe.aprobad</w:t>
-            </w:r>
-            <w:r>
-              <w:rPr>
-                <w:rFonts w:ascii="Arial" w:hAnsi="Arial" w:cs="Arial"/>
-                <w:sz w:val="22"/>
-                <w:szCs w:val="22"/>
-              </w:rPr>
-              <w:lastRenderedPageBreak/>
-              <w:t>as_desayuno_miercoles</w:t>
+              <w:t>informe.aprobadas</w:t>
+            </w:r>
+            <w:proofErr w:type="spellEnd"/>
+            <w:r>
+              <w:rPr>
+                <w:rFonts w:ascii="Arial" w:hAnsi="Arial" w:cs="Arial"/>
+                <w:sz w:val="22"/>
+                <w:szCs w:val="22"/>
+              </w:rPr>
+              <w:t>_</w:t>
+            </w:r>
+            <w:r>
+              <w:rPr>
+                <w:rFonts w:ascii="Arial" w:hAnsi="Arial" w:cs="Arial"/>
+                <w:sz w:val="22"/>
+                <w:szCs w:val="22"/>
+              </w:rPr>
+              <w:t xml:space="preserve"> </w:t>
+            </w:r>
+            <w:proofErr w:type="spellStart"/>
+            <w:r>
+              <w:rPr>
+                <w:rFonts w:ascii="Arial" w:hAnsi="Arial" w:cs="Arial"/>
+                <w:sz w:val="22"/>
+                <w:szCs w:val="22"/>
+              </w:rPr>
+              <w:t>ultimo_convenio</w:t>
+            </w:r>
+            <w:r>
+              <w:rPr>
+                <w:rFonts w:ascii="Arial" w:hAnsi="Arial" w:cs="Arial"/>
+                <w:sz w:val="22"/>
+                <w:szCs w:val="22"/>
+              </w:rPr>
+              <w:t>_</w:t>
+            </w:r>
+            <w:r>
+              <w:rPr>
+                <w:rFonts w:ascii="Arial" w:hAnsi="Arial" w:cs="Arial"/>
+                <w:sz w:val="22"/>
+                <w:szCs w:val="22"/>
+              </w:rPr>
+              <w:t>desayuno_miercoles</w:t>
             </w:r>
             <w:proofErr w:type="spellEnd"/>
             <w:r>
@@ -2891,7 +3242,6 @@
                 <w:sz w:val="22"/>
                 <w:szCs w:val="22"/>
               </w:rPr>
-              <w:lastRenderedPageBreak/>
               <w:t xml:space="preserve">{{ </w:t>
             </w:r>
             <w:proofErr w:type="spellStart"/>
@@ -2901,16 +3251,49 @@
                 <w:sz w:val="22"/>
                 <w:szCs w:val="22"/>
               </w:rPr>
-              <w:t>informe.aprobad</w:t>
-            </w:r>
-            <w:r>
-              <w:rPr>
-                <w:rFonts w:ascii="Arial" w:hAnsi="Arial" w:cs="Arial"/>
-                <w:sz w:val="22"/>
-                <w:szCs w:val="22"/>
-              </w:rPr>
-              <w:lastRenderedPageBreak/>
-              <w:t>as_almuerzo_miercoles</w:t>
+              <w:t>informe.aprobadas</w:t>
+            </w:r>
+            <w:proofErr w:type="spellEnd"/>
+            <w:r>
+              <w:rPr>
+                <w:rFonts w:ascii="Arial" w:hAnsi="Arial" w:cs="Arial"/>
+                <w:sz w:val="22"/>
+                <w:szCs w:val="22"/>
+              </w:rPr>
+              <w:t>_</w:t>
+            </w:r>
+            <w:r>
+              <w:rPr>
+                <w:rFonts w:ascii="Arial" w:hAnsi="Arial" w:cs="Arial"/>
+                <w:sz w:val="22"/>
+                <w:szCs w:val="22"/>
+              </w:rPr>
+              <w:t xml:space="preserve"> </w:t>
+            </w:r>
+            <w:proofErr w:type="spellStart"/>
+            <w:r>
+              <w:rPr>
+                <w:rFonts w:ascii="Arial" w:hAnsi="Arial" w:cs="Arial"/>
+                <w:sz w:val="22"/>
+                <w:szCs w:val="22"/>
+              </w:rPr>
+              <w:t>ultimo_convenio</w:t>
+            </w:r>
+            <w:r>
+              <w:rPr>
+                <w:rFonts w:ascii="Arial" w:hAnsi="Arial" w:cs="Arial"/>
+                <w:sz w:val="22"/>
+                <w:szCs w:val="22"/>
+              </w:rPr>
+              <w:t>_</w:t>
+            </w:r>
+            <w:r>
+              <w:rPr>
+                <w:rFonts w:ascii="Arial" w:hAnsi="Arial" w:cs="Arial"/>
+                <w:sz w:val="22"/>
+                <w:szCs w:val="22"/>
+              </w:rPr>
+              <w:t>almuerzo_miercoles</w:t>
             </w:r>
             <w:proofErr w:type="spellEnd"/>
             <w:r>
@@ -2945,7 +3328,6 @@
                 <w:sz w:val="22"/>
                 <w:szCs w:val="22"/>
               </w:rPr>
-              <w:lastRenderedPageBreak/>
               <w:t xml:space="preserve">{{ </w:t>
             </w:r>
             <w:proofErr w:type="spellStart"/>
@@ -2955,16 +3337,49 @@
                 <w:sz w:val="22"/>
                 <w:szCs w:val="22"/>
               </w:rPr>
-              <w:t>informe.aprobad</w:t>
-            </w:r>
-            <w:r>
-              <w:rPr>
-                <w:rFonts w:ascii="Arial" w:hAnsi="Arial" w:cs="Arial"/>
-                <w:sz w:val="22"/>
-                <w:szCs w:val="22"/>
-              </w:rPr>
-              <w:lastRenderedPageBreak/>
-              <w:t>as_merienda_miercoles</w:t>
+              <w:t>informe.aprobadas</w:t>
+            </w:r>
+            <w:proofErr w:type="spellEnd"/>
+            <w:r>
+              <w:rPr>
+                <w:rFonts w:ascii="Arial" w:hAnsi="Arial" w:cs="Arial"/>
+                <w:sz w:val="22"/>
+                <w:szCs w:val="22"/>
+              </w:rPr>
+              <w:t>_</w:t>
+            </w:r>
+            <w:r>
+              <w:rPr>
+                <w:rFonts w:ascii="Arial" w:hAnsi="Arial" w:cs="Arial"/>
+                <w:sz w:val="22"/>
+                <w:szCs w:val="22"/>
+              </w:rPr>
+              <w:t xml:space="preserve"> </w:t>
+            </w:r>
+            <w:proofErr w:type="spellStart"/>
+            <w:r>
+              <w:rPr>
+                <w:rFonts w:ascii="Arial" w:hAnsi="Arial" w:cs="Arial"/>
+                <w:sz w:val="22"/>
+                <w:szCs w:val="22"/>
+              </w:rPr>
+              <w:t>ultimo_convenio</w:t>
+            </w:r>
+            <w:r>
+              <w:rPr>
+                <w:rFonts w:ascii="Arial" w:hAnsi="Arial" w:cs="Arial"/>
+                <w:sz w:val="22"/>
+                <w:szCs w:val="22"/>
+              </w:rPr>
+              <w:t>_</w:t>
+            </w:r>
+            <w:r>
+              <w:rPr>
+                <w:rFonts w:ascii="Arial" w:hAnsi="Arial" w:cs="Arial"/>
+                <w:sz w:val="22"/>
+                <w:szCs w:val="22"/>
+              </w:rPr>
+              <w:t>merienda_miercoles</w:t>
             </w:r>
             <w:proofErr w:type="spellEnd"/>
             <w:r>
@@ -2999,7 +3414,6 @@
                 <w:sz w:val="22"/>
                 <w:szCs w:val="22"/>
               </w:rPr>
-              <w:lastRenderedPageBreak/>
               <w:t xml:space="preserve">{{ </w:t>
             </w:r>
             <w:proofErr w:type="spellStart"/>
@@ -3009,16 +3423,49 @@
                 <w:sz w:val="22"/>
                 <w:szCs w:val="22"/>
               </w:rPr>
-              <w:t>informe.aprobad</w:t>
-            </w:r>
-            <w:r>
-              <w:rPr>
-                <w:rFonts w:ascii="Arial" w:hAnsi="Arial" w:cs="Arial"/>
-                <w:sz w:val="22"/>
-                <w:szCs w:val="22"/>
-              </w:rPr>
-              <w:lastRenderedPageBreak/>
-              <w:t>as_cena_miercoles</w:t>
+              <w:t>informe.aprobadas</w:t>
+            </w:r>
+            <w:proofErr w:type="spellEnd"/>
+            <w:r>
+              <w:rPr>
+                <w:rFonts w:ascii="Arial" w:hAnsi="Arial" w:cs="Arial"/>
+                <w:sz w:val="22"/>
+                <w:szCs w:val="22"/>
+              </w:rPr>
+              <w:t>_</w:t>
+            </w:r>
+            <w:r>
+              <w:rPr>
+                <w:rFonts w:ascii="Arial" w:hAnsi="Arial" w:cs="Arial"/>
+                <w:sz w:val="22"/>
+                <w:szCs w:val="22"/>
+              </w:rPr>
+              <w:t xml:space="preserve"> </w:t>
+            </w:r>
+            <w:proofErr w:type="spellStart"/>
+            <w:r>
+              <w:rPr>
+                <w:rFonts w:ascii="Arial" w:hAnsi="Arial" w:cs="Arial"/>
+                <w:sz w:val="22"/>
+                <w:szCs w:val="22"/>
+              </w:rPr>
+              <w:t>ultimo_convenio</w:t>
+            </w:r>
+            <w:r>
+              <w:rPr>
+                <w:rFonts w:ascii="Arial" w:hAnsi="Arial" w:cs="Arial"/>
+                <w:sz w:val="22"/>
+                <w:szCs w:val="22"/>
+              </w:rPr>
+              <w:t>_</w:t>
+            </w:r>
+            <w:r>
+              <w:rPr>
+                <w:rFonts w:ascii="Arial" w:hAnsi="Arial" w:cs="Arial"/>
+                <w:sz w:val="22"/>
+                <w:szCs w:val="22"/>
+              </w:rPr>
+              <w:t>cena_miercoles</w:t>
             </w:r>
             <w:proofErr w:type="spellEnd"/>
             <w:r>
@@ -3057,7 +3504,6 @@
                 <w:sz w:val="22"/>
                 <w:szCs w:val="22"/>
               </w:rPr>
-              <w:lastRenderedPageBreak/>
               <w:t>Jueves</w:t>
             </w:r>
           </w:p>
@@ -3093,7 +3539,49 @@
                 <w:sz w:val="22"/>
                 <w:szCs w:val="22"/>
               </w:rPr>
-              <w:t>informe.aprobadas_desayuno_jueves</w:t>
+              <w:t>informe.aprobadas</w:t>
+            </w:r>
+            <w:proofErr w:type="spellEnd"/>
+            <w:r>
+              <w:rPr>
+                <w:rFonts w:ascii="Arial" w:hAnsi="Arial" w:cs="Arial"/>
+                <w:sz w:val="22"/>
+                <w:szCs w:val="22"/>
+              </w:rPr>
+              <w:t>_</w:t>
+            </w:r>
+            <w:r>
+              <w:rPr>
+                <w:rFonts w:ascii="Arial" w:hAnsi="Arial" w:cs="Arial"/>
+                <w:sz w:val="22"/>
+                <w:szCs w:val="22"/>
+              </w:rPr>
+              <w:t xml:space="preserve"> </w:t>
+            </w:r>
+            <w:proofErr w:type="spellStart"/>
+            <w:r>
+              <w:rPr>
+                <w:rFonts w:ascii="Arial" w:hAnsi="Arial" w:cs="Arial"/>
+                <w:sz w:val="22"/>
+                <w:szCs w:val="22"/>
+              </w:rPr>
+              <w:t>ultimo_convenio</w:t>
+            </w:r>
+            <w:r>
+              <w:rPr>
+                <w:rFonts w:ascii="Arial" w:hAnsi="Arial" w:cs="Arial"/>
+                <w:sz w:val="22"/>
+                <w:szCs w:val="22"/>
+              </w:rPr>
+              <w:t>_</w:t>
+            </w:r>
+            <w:r>
+              <w:rPr>
+                <w:rFonts w:ascii="Arial" w:hAnsi="Arial" w:cs="Arial"/>
+                <w:sz w:val="22"/>
+                <w:szCs w:val="22"/>
+              </w:rPr>
+              <w:t>desayuno_jueves</w:t>
             </w:r>
             <w:proofErr w:type="spellEnd"/>
             <w:r>
@@ -3137,7 +3625,49 @@
                 <w:sz w:val="22"/>
                 <w:szCs w:val="22"/>
               </w:rPr>
-              <w:t>informe.aprobadas_almuerzo_jueves</w:t>
+              <w:t>informe.aprobadas</w:t>
+            </w:r>
+            <w:proofErr w:type="spellEnd"/>
+            <w:r>
+              <w:rPr>
+                <w:rFonts w:ascii="Arial" w:hAnsi="Arial" w:cs="Arial"/>
+                <w:sz w:val="22"/>
+                <w:szCs w:val="22"/>
+              </w:rPr>
+              <w:t>_</w:t>
+            </w:r>
+            <w:r>
+              <w:rPr>
+                <w:rFonts w:ascii="Arial" w:hAnsi="Arial" w:cs="Arial"/>
+                <w:sz w:val="22"/>
+                <w:szCs w:val="22"/>
+              </w:rPr>
+              <w:t xml:space="preserve"> </w:t>
+            </w:r>
+            <w:proofErr w:type="spellStart"/>
+            <w:r>
+              <w:rPr>
+                <w:rFonts w:ascii="Arial" w:hAnsi="Arial" w:cs="Arial"/>
+                <w:sz w:val="22"/>
+                <w:szCs w:val="22"/>
+              </w:rPr>
+              <w:t>ultimo_convenio</w:t>
+            </w:r>
+            <w:r>
+              <w:rPr>
+                <w:rFonts w:ascii="Arial" w:hAnsi="Arial" w:cs="Arial"/>
+                <w:sz w:val="22"/>
+                <w:szCs w:val="22"/>
+              </w:rPr>
+              <w:t>_</w:t>
+            </w:r>
+            <w:r>
+              <w:rPr>
+                <w:rFonts w:ascii="Arial" w:hAnsi="Arial" w:cs="Arial"/>
+                <w:sz w:val="22"/>
+                <w:szCs w:val="22"/>
+              </w:rPr>
+              <w:t>almuerzo_jueves</w:t>
             </w:r>
             <w:proofErr w:type="spellEnd"/>
             <w:r>
@@ -3181,7 +3711,49 @@
                 <w:sz w:val="22"/>
                 <w:szCs w:val="22"/>
               </w:rPr>
-              <w:t>informe.aprobadas_merienda_jueves</w:t>
+              <w:t>informe.aprobadas</w:t>
+            </w:r>
+            <w:proofErr w:type="spellEnd"/>
+            <w:r>
+              <w:rPr>
+                <w:rFonts w:ascii="Arial" w:hAnsi="Arial" w:cs="Arial"/>
+                <w:sz w:val="22"/>
+                <w:szCs w:val="22"/>
+              </w:rPr>
+              <w:t>_</w:t>
+            </w:r>
+            <w:r>
+              <w:rPr>
+                <w:rFonts w:ascii="Arial" w:hAnsi="Arial" w:cs="Arial"/>
+                <w:sz w:val="22"/>
+                <w:szCs w:val="22"/>
+              </w:rPr>
+              <w:t xml:space="preserve"> </w:t>
+            </w:r>
+            <w:proofErr w:type="spellStart"/>
+            <w:r>
+              <w:rPr>
+                <w:rFonts w:ascii="Arial" w:hAnsi="Arial" w:cs="Arial"/>
+                <w:sz w:val="22"/>
+                <w:szCs w:val="22"/>
+              </w:rPr>
+              <w:t>ultimo_convenio</w:t>
+            </w:r>
+            <w:r>
+              <w:rPr>
+                <w:rFonts w:ascii="Arial" w:hAnsi="Arial" w:cs="Arial"/>
+                <w:sz w:val="22"/>
+                <w:szCs w:val="22"/>
+              </w:rPr>
+              <w:t>_</w:t>
+            </w:r>
+            <w:r>
+              <w:rPr>
+                <w:rFonts w:ascii="Arial" w:hAnsi="Arial" w:cs="Arial"/>
+                <w:sz w:val="22"/>
+                <w:szCs w:val="22"/>
+              </w:rPr>
+              <w:t>merienda_jueves</w:t>
             </w:r>
             <w:proofErr w:type="spellEnd"/>
             <w:r>
@@ -3225,7 +3797,49 @@
                 <w:sz w:val="22"/>
                 <w:szCs w:val="22"/>
               </w:rPr>
-              <w:t>informe.aprobadas_cena_jueves</w:t>
+              <w:t>informe.aprobadas</w:t>
+            </w:r>
+            <w:proofErr w:type="spellEnd"/>
+            <w:r>
+              <w:rPr>
+                <w:rFonts w:ascii="Arial" w:hAnsi="Arial" w:cs="Arial"/>
+                <w:sz w:val="22"/>
+                <w:szCs w:val="22"/>
+              </w:rPr>
+              <w:t>_</w:t>
+            </w:r>
+            <w:r>
+              <w:rPr>
+                <w:rFonts w:ascii="Arial" w:hAnsi="Arial" w:cs="Arial"/>
+                <w:sz w:val="22"/>
+                <w:szCs w:val="22"/>
+              </w:rPr>
+              <w:t xml:space="preserve"> </w:t>
+            </w:r>
+            <w:proofErr w:type="spellStart"/>
+            <w:r>
+              <w:rPr>
+                <w:rFonts w:ascii="Arial" w:hAnsi="Arial" w:cs="Arial"/>
+                <w:sz w:val="22"/>
+                <w:szCs w:val="22"/>
+              </w:rPr>
+              <w:t>ultimo_convenio</w:t>
+            </w:r>
+            <w:r>
+              <w:rPr>
+                <w:rFonts w:ascii="Arial" w:hAnsi="Arial" w:cs="Arial"/>
+                <w:sz w:val="22"/>
+                <w:szCs w:val="22"/>
+              </w:rPr>
+              <w:t>_</w:t>
+            </w:r>
+            <w:r>
+              <w:rPr>
+                <w:rFonts w:ascii="Arial" w:hAnsi="Arial" w:cs="Arial"/>
+                <w:sz w:val="22"/>
+                <w:szCs w:val="22"/>
+              </w:rPr>
+              <w:t>cena_jueves</w:t>
             </w:r>
             <w:proofErr w:type="spellEnd"/>
             <w:r>
@@ -3299,7 +3913,49 @@
                 <w:sz w:val="22"/>
                 <w:szCs w:val="22"/>
               </w:rPr>
-              <w:t>informe.aprobadas_desayuno_viernes</w:t>
+              <w:t>informe.aprobadas</w:t>
+            </w:r>
+            <w:proofErr w:type="spellEnd"/>
+            <w:r>
+              <w:rPr>
+                <w:rFonts w:ascii="Arial" w:hAnsi="Arial" w:cs="Arial"/>
+                <w:sz w:val="22"/>
+                <w:szCs w:val="22"/>
+              </w:rPr>
+              <w:t>_</w:t>
+            </w:r>
+            <w:r>
+              <w:rPr>
+                <w:rFonts w:ascii="Arial" w:hAnsi="Arial" w:cs="Arial"/>
+                <w:sz w:val="22"/>
+                <w:szCs w:val="22"/>
+              </w:rPr>
+              <w:t xml:space="preserve"> </w:t>
+            </w:r>
+            <w:proofErr w:type="spellStart"/>
+            <w:r>
+              <w:rPr>
+                <w:rFonts w:ascii="Arial" w:hAnsi="Arial" w:cs="Arial"/>
+                <w:sz w:val="22"/>
+                <w:szCs w:val="22"/>
+              </w:rPr>
+              <w:t>ultimo_convenio</w:t>
+            </w:r>
+            <w:r>
+              <w:rPr>
+                <w:rFonts w:ascii="Arial" w:hAnsi="Arial" w:cs="Arial"/>
+                <w:sz w:val="22"/>
+                <w:szCs w:val="22"/>
+              </w:rPr>
+              <w:t>_</w:t>
+            </w:r>
+            <w:r>
+              <w:rPr>
+                <w:rFonts w:ascii="Arial" w:hAnsi="Arial" w:cs="Arial"/>
+                <w:sz w:val="22"/>
+                <w:szCs w:val="22"/>
+              </w:rPr>
+              <w:t>desayuno_viernes</w:t>
             </w:r>
             <w:proofErr w:type="spellEnd"/>
             <w:r>
@@ -3343,7 +3999,49 @@
                 <w:sz w:val="22"/>
                 <w:szCs w:val="22"/>
               </w:rPr>
-              <w:t>informe.aprobadas_almuerzo_viernes</w:t>
+              <w:t>informe.aprobadas</w:t>
+            </w:r>
+            <w:proofErr w:type="spellEnd"/>
+            <w:r>
+              <w:rPr>
+                <w:rFonts w:ascii="Arial" w:hAnsi="Arial" w:cs="Arial"/>
+                <w:sz w:val="22"/>
+                <w:szCs w:val="22"/>
+              </w:rPr>
+              <w:t>_</w:t>
+            </w:r>
+            <w:r>
+              <w:rPr>
+                <w:rFonts w:ascii="Arial" w:hAnsi="Arial" w:cs="Arial"/>
+                <w:sz w:val="22"/>
+                <w:szCs w:val="22"/>
+              </w:rPr>
+              <w:t xml:space="preserve"> </w:t>
+            </w:r>
+            <w:proofErr w:type="spellStart"/>
+            <w:r>
+              <w:rPr>
+                <w:rFonts w:ascii="Arial" w:hAnsi="Arial" w:cs="Arial"/>
+                <w:sz w:val="22"/>
+                <w:szCs w:val="22"/>
+              </w:rPr>
+              <w:t>ultimo_convenio</w:t>
+            </w:r>
+            <w:r>
+              <w:rPr>
+                <w:rFonts w:ascii="Arial" w:hAnsi="Arial" w:cs="Arial"/>
+                <w:sz w:val="22"/>
+                <w:szCs w:val="22"/>
+              </w:rPr>
+              <w:t>_</w:t>
+            </w:r>
+            <w:r>
+              <w:rPr>
+                <w:rFonts w:ascii="Arial" w:hAnsi="Arial" w:cs="Arial"/>
+                <w:sz w:val="22"/>
+                <w:szCs w:val="22"/>
+              </w:rPr>
+              <w:t>almuerzo_viernes</w:t>
             </w:r>
             <w:proofErr w:type="spellEnd"/>
             <w:r>
@@ -3387,7 +4085,49 @@
                 <w:sz w:val="22"/>
                 <w:szCs w:val="22"/>
               </w:rPr>
-              <w:t>informe.aprobadas_merienda_viernes</w:t>
+              <w:t>informe.aprobadas</w:t>
+            </w:r>
+            <w:proofErr w:type="spellEnd"/>
+            <w:r>
+              <w:rPr>
+                <w:rFonts w:ascii="Arial" w:hAnsi="Arial" w:cs="Arial"/>
+                <w:sz w:val="22"/>
+                <w:szCs w:val="22"/>
+              </w:rPr>
+              <w:t>_</w:t>
+            </w:r>
+            <w:r>
+              <w:rPr>
+                <w:rFonts w:ascii="Arial" w:hAnsi="Arial" w:cs="Arial"/>
+                <w:sz w:val="22"/>
+                <w:szCs w:val="22"/>
+              </w:rPr>
+              <w:t xml:space="preserve"> </w:t>
+            </w:r>
+            <w:proofErr w:type="spellStart"/>
+            <w:r>
+              <w:rPr>
+                <w:rFonts w:ascii="Arial" w:hAnsi="Arial" w:cs="Arial"/>
+                <w:sz w:val="22"/>
+                <w:szCs w:val="22"/>
+              </w:rPr>
+              <w:t>ultimo_convenio</w:t>
+            </w:r>
+            <w:r>
+              <w:rPr>
+                <w:rFonts w:ascii="Arial" w:hAnsi="Arial" w:cs="Arial"/>
+                <w:sz w:val="22"/>
+                <w:szCs w:val="22"/>
+              </w:rPr>
+              <w:t>_</w:t>
+            </w:r>
+            <w:r>
+              <w:rPr>
+                <w:rFonts w:ascii="Arial" w:hAnsi="Arial" w:cs="Arial"/>
+                <w:sz w:val="22"/>
+                <w:szCs w:val="22"/>
+              </w:rPr>
+              <w:t>merienda_viernes</w:t>
             </w:r>
             <w:proofErr w:type="spellEnd"/>
             <w:r>
@@ -3431,7 +4171,49 @@
                 <w:sz w:val="22"/>
                 <w:szCs w:val="22"/>
               </w:rPr>
-              <w:t>informe.aprobadas_cena_viernes</w:t>
+              <w:t>informe.aprobadas</w:t>
+            </w:r>
+            <w:proofErr w:type="spellEnd"/>
+            <w:r>
+              <w:rPr>
+                <w:rFonts w:ascii="Arial" w:hAnsi="Arial" w:cs="Arial"/>
+                <w:sz w:val="22"/>
+                <w:szCs w:val="22"/>
+              </w:rPr>
+              <w:t>_</w:t>
+            </w:r>
+            <w:r>
+              <w:rPr>
+                <w:rFonts w:ascii="Arial" w:hAnsi="Arial" w:cs="Arial"/>
+                <w:sz w:val="22"/>
+                <w:szCs w:val="22"/>
+              </w:rPr>
+              <w:t xml:space="preserve"> </w:t>
+            </w:r>
+            <w:proofErr w:type="spellStart"/>
+            <w:r>
+              <w:rPr>
+                <w:rFonts w:ascii="Arial" w:hAnsi="Arial" w:cs="Arial"/>
+                <w:sz w:val="22"/>
+                <w:szCs w:val="22"/>
+              </w:rPr>
+              <w:t>ultimo_convenio</w:t>
+            </w:r>
+            <w:r>
+              <w:rPr>
+                <w:rFonts w:ascii="Arial" w:hAnsi="Arial" w:cs="Arial"/>
+                <w:sz w:val="22"/>
+                <w:szCs w:val="22"/>
+              </w:rPr>
+              <w:t>_</w:t>
+            </w:r>
+            <w:r>
+              <w:rPr>
+                <w:rFonts w:ascii="Arial" w:hAnsi="Arial" w:cs="Arial"/>
+                <w:sz w:val="22"/>
+                <w:szCs w:val="22"/>
+              </w:rPr>
+              <w:t>cena_viernes</w:t>
             </w:r>
             <w:proofErr w:type="spellEnd"/>
             <w:r>
@@ -3505,7 +4287,49 @@
                 <w:sz w:val="22"/>
                 <w:szCs w:val="22"/>
               </w:rPr>
-              <w:t>informe.aprobadas_desayuno_sabado</w:t>
+              <w:t>informe.aprobadas</w:t>
+            </w:r>
+            <w:proofErr w:type="spellEnd"/>
+            <w:r>
+              <w:rPr>
+                <w:rFonts w:ascii="Arial" w:hAnsi="Arial" w:cs="Arial"/>
+                <w:sz w:val="22"/>
+                <w:szCs w:val="22"/>
+              </w:rPr>
+              <w:t>_</w:t>
+            </w:r>
+            <w:r>
+              <w:rPr>
+                <w:rFonts w:ascii="Arial" w:hAnsi="Arial" w:cs="Arial"/>
+                <w:sz w:val="22"/>
+                <w:szCs w:val="22"/>
+              </w:rPr>
+              <w:t xml:space="preserve"> </w:t>
+            </w:r>
+            <w:proofErr w:type="spellStart"/>
+            <w:r>
+              <w:rPr>
+                <w:rFonts w:ascii="Arial" w:hAnsi="Arial" w:cs="Arial"/>
+                <w:sz w:val="22"/>
+                <w:szCs w:val="22"/>
+              </w:rPr>
+              <w:t>ultimo_convenio</w:t>
+            </w:r>
+            <w:r>
+              <w:rPr>
+                <w:rFonts w:ascii="Arial" w:hAnsi="Arial" w:cs="Arial"/>
+                <w:sz w:val="22"/>
+                <w:szCs w:val="22"/>
+              </w:rPr>
+              <w:t>_</w:t>
+            </w:r>
+            <w:r>
+              <w:rPr>
+                <w:rFonts w:ascii="Arial" w:hAnsi="Arial" w:cs="Arial"/>
+                <w:sz w:val="22"/>
+                <w:szCs w:val="22"/>
+              </w:rPr>
+              <w:t>desayuno_sabado</w:t>
             </w:r>
             <w:proofErr w:type="spellEnd"/>
             <w:r>
@@ -3549,7 +4373,49 @@
                 <w:sz w:val="22"/>
                 <w:szCs w:val="22"/>
               </w:rPr>
-              <w:t>informe.aprobadas_almuerzo_sabado</w:t>
+              <w:t>informe.aprobadas</w:t>
+            </w:r>
+            <w:proofErr w:type="spellEnd"/>
+            <w:r>
+              <w:rPr>
+                <w:rFonts w:ascii="Arial" w:hAnsi="Arial" w:cs="Arial"/>
+                <w:sz w:val="22"/>
+                <w:szCs w:val="22"/>
+              </w:rPr>
+              <w:t>_</w:t>
+            </w:r>
+            <w:r>
+              <w:rPr>
+                <w:rFonts w:ascii="Arial" w:hAnsi="Arial" w:cs="Arial"/>
+                <w:sz w:val="22"/>
+                <w:szCs w:val="22"/>
+              </w:rPr>
+              <w:t xml:space="preserve"> </w:t>
+            </w:r>
+            <w:proofErr w:type="spellStart"/>
+            <w:r>
+              <w:rPr>
+                <w:rFonts w:ascii="Arial" w:hAnsi="Arial" w:cs="Arial"/>
+                <w:sz w:val="22"/>
+                <w:szCs w:val="22"/>
+              </w:rPr>
+              <w:t>ultimo_convenio</w:t>
+            </w:r>
+            <w:r>
+              <w:rPr>
+                <w:rFonts w:ascii="Arial" w:hAnsi="Arial" w:cs="Arial"/>
+                <w:sz w:val="22"/>
+                <w:szCs w:val="22"/>
+              </w:rPr>
+              <w:t>_</w:t>
+            </w:r>
+            <w:r>
+              <w:rPr>
+                <w:rFonts w:ascii="Arial" w:hAnsi="Arial" w:cs="Arial"/>
+                <w:sz w:val="22"/>
+                <w:szCs w:val="22"/>
+              </w:rPr>
+              <w:t>almuerzo_sabado</w:t>
             </w:r>
             <w:proofErr w:type="spellEnd"/>
             <w:r>
@@ -3593,7 +4459,49 @@
                 <w:sz w:val="22"/>
                 <w:szCs w:val="22"/>
               </w:rPr>
-              <w:t>informe.aprobadas_merienda_sabado</w:t>
+              <w:t>informe.aprobadas</w:t>
+            </w:r>
+            <w:proofErr w:type="spellEnd"/>
+            <w:r>
+              <w:rPr>
+                <w:rFonts w:ascii="Arial" w:hAnsi="Arial" w:cs="Arial"/>
+                <w:sz w:val="22"/>
+                <w:szCs w:val="22"/>
+              </w:rPr>
+              <w:t>_</w:t>
+            </w:r>
+            <w:r>
+              <w:rPr>
+                <w:rFonts w:ascii="Arial" w:hAnsi="Arial" w:cs="Arial"/>
+                <w:sz w:val="22"/>
+                <w:szCs w:val="22"/>
+              </w:rPr>
+              <w:t xml:space="preserve"> </w:t>
+            </w:r>
+            <w:proofErr w:type="spellStart"/>
+            <w:r>
+              <w:rPr>
+                <w:rFonts w:ascii="Arial" w:hAnsi="Arial" w:cs="Arial"/>
+                <w:sz w:val="22"/>
+                <w:szCs w:val="22"/>
+              </w:rPr>
+              <w:t>ultimo_convenio</w:t>
+            </w:r>
+            <w:r>
+              <w:rPr>
+                <w:rFonts w:ascii="Arial" w:hAnsi="Arial" w:cs="Arial"/>
+                <w:sz w:val="22"/>
+                <w:szCs w:val="22"/>
+              </w:rPr>
+              <w:t>_</w:t>
+            </w:r>
+            <w:r>
+              <w:rPr>
+                <w:rFonts w:ascii="Arial" w:hAnsi="Arial" w:cs="Arial"/>
+                <w:sz w:val="22"/>
+                <w:szCs w:val="22"/>
+              </w:rPr>
+              <w:t>merienda_sabado</w:t>
             </w:r>
             <w:proofErr w:type="spellEnd"/>
             <w:r>
@@ -3637,7 +4545,49 @@
                 <w:sz w:val="22"/>
                 <w:szCs w:val="22"/>
               </w:rPr>
-              <w:t>informe.aprobadas_cena_sabado</w:t>
+              <w:t>informe.aprobadas</w:t>
+            </w:r>
+            <w:proofErr w:type="spellEnd"/>
+            <w:r>
+              <w:rPr>
+                <w:rFonts w:ascii="Arial" w:hAnsi="Arial" w:cs="Arial"/>
+                <w:sz w:val="22"/>
+                <w:szCs w:val="22"/>
+              </w:rPr>
+              <w:t>_</w:t>
+            </w:r>
+            <w:r>
+              <w:rPr>
+                <w:rFonts w:ascii="Arial" w:hAnsi="Arial" w:cs="Arial"/>
+                <w:sz w:val="22"/>
+                <w:szCs w:val="22"/>
+              </w:rPr>
+              <w:t xml:space="preserve"> </w:t>
+            </w:r>
+            <w:proofErr w:type="spellStart"/>
+            <w:r>
+              <w:rPr>
+                <w:rFonts w:ascii="Arial" w:hAnsi="Arial" w:cs="Arial"/>
+                <w:sz w:val="22"/>
+                <w:szCs w:val="22"/>
+              </w:rPr>
+              <w:t>ultimo_convenio</w:t>
+            </w:r>
+            <w:r>
+              <w:rPr>
+                <w:rFonts w:ascii="Arial" w:hAnsi="Arial" w:cs="Arial"/>
+                <w:sz w:val="22"/>
+                <w:szCs w:val="22"/>
+              </w:rPr>
+              <w:t>_</w:t>
+            </w:r>
+            <w:r>
+              <w:rPr>
+                <w:rFonts w:ascii="Arial" w:hAnsi="Arial" w:cs="Arial"/>
+                <w:sz w:val="22"/>
+                <w:szCs w:val="22"/>
+              </w:rPr>
+              <w:t>cena_sabado</w:t>
             </w:r>
             <w:proofErr w:type="spellEnd"/>
             <w:r>
@@ -3711,7 +4661,49 @@
                 <w:sz w:val="22"/>
                 <w:szCs w:val="22"/>
               </w:rPr>
-              <w:t>informe.aprobadas_desayuno_domingo</w:t>
+              <w:t>informe.aprobadas</w:t>
+            </w:r>
+            <w:proofErr w:type="spellEnd"/>
+            <w:r>
+              <w:rPr>
+                <w:rFonts w:ascii="Arial" w:hAnsi="Arial" w:cs="Arial"/>
+                <w:sz w:val="22"/>
+                <w:szCs w:val="22"/>
+              </w:rPr>
+              <w:t>_</w:t>
+            </w:r>
+            <w:r>
+              <w:rPr>
+                <w:rFonts w:ascii="Arial" w:hAnsi="Arial" w:cs="Arial"/>
+                <w:sz w:val="22"/>
+                <w:szCs w:val="22"/>
+              </w:rPr>
+              <w:t xml:space="preserve"> </w:t>
+            </w:r>
+            <w:proofErr w:type="spellStart"/>
+            <w:r>
+              <w:rPr>
+                <w:rFonts w:ascii="Arial" w:hAnsi="Arial" w:cs="Arial"/>
+                <w:sz w:val="22"/>
+                <w:szCs w:val="22"/>
+              </w:rPr>
+              <w:t>ultimo_convenio</w:t>
+            </w:r>
+            <w:r>
+              <w:rPr>
+                <w:rFonts w:ascii="Arial" w:hAnsi="Arial" w:cs="Arial"/>
+                <w:sz w:val="22"/>
+                <w:szCs w:val="22"/>
+              </w:rPr>
+              <w:t>_</w:t>
+            </w:r>
+            <w:r>
+              <w:rPr>
+                <w:rFonts w:ascii="Arial" w:hAnsi="Arial" w:cs="Arial"/>
+                <w:sz w:val="22"/>
+                <w:szCs w:val="22"/>
+              </w:rPr>
+              <w:t>desayuno_domingo</w:t>
             </w:r>
             <w:proofErr w:type="spellEnd"/>
             <w:r>
@@ -3755,7 +4747,49 @@
                 <w:sz w:val="22"/>
                 <w:szCs w:val="22"/>
               </w:rPr>
-              <w:t>informe.aprobadas_almuerzo_domingo</w:t>
+              <w:t>informe.aprobadas</w:t>
+            </w:r>
+            <w:proofErr w:type="spellEnd"/>
+            <w:r>
+              <w:rPr>
+                <w:rFonts w:ascii="Arial" w:hAnsi="Arial" w:cs="Arial"/>
+                <w:sz w:val="22"/>
+                <w:szCs w:val="22"/>
+              </w:rPr>
+              <w:t>_</w:t>
+            </w:r>
+            <w:r>
+              <w:rPr>
+                <w:rFonts w:ascii="Arial" w:hAnsi="Arial" w:cs="Arial"/>
+                <w:sz w:val="22"/>
+                <w:szCs w:val="22"/>
+              </w:rPr>
+              <w:t xml:space="preserve"> </w:t>
+            </w:r>
+            <w:proofErr w:type="spellStart"/>
+            <w:r>
+              <w:rPr>
+                <w:rFonts w:ascii="Arial" w:hAnsi="Arial" w:cs="Arial"/>
+                <w:sz w:val="22"/>
+                <w:szCs w:val="22"/>
+              </w:rPr>
+              <w:t>ultimo_convenio</w:t>
+            </w:r>
+            <w:r>
+              <w:rPr>
+                <w:rFonts w:ascii="Arial" w:hAnsi="Arial" w:cs="Arial"/>
+                <w:sz w:val="22"/>
+                <w:szCs w:val="22"/>
+              </w:rPr>
+              <w:t>_</w:t>
+            </w:r>
+            <w:r>
+              <w:rPr>
+                <w:rFonts w:ascii="Arial" w:hAnsi="Arial" w:cs="Arial"/>
+                <w:sz w:val="22"/>
+                <w:szCs w:val="22"/>
+              </w:rPr>
+              <w:t>almuerzo_domingo</w:t>
             </w:r>
             <w:proofErr w:type="spellEnd"/>
             <w:r>
@@ -3799,7 +4833,49 @@
                 <w:sz w:val="22"/>
                 <w:szCs w:val="22"/>
               </w:rPr>
-              <w:t>informe.aprobadas_merienda_domingo</w:t>
+              <w:t>informe.aprobadas</w:t>
+            </w:r>
+            <w:proofErr w:type="spellEnd"/>
+            <w:r>
+              <w:rPr>
+                <w:rFonts w:ascii="Arial" w:hAnsi="Arial" w:cs="Arial"/>
+                <w:sz w:val="22"/>
+                <w:szCs w:val="22"/>
+              </w:rPr>
+              <w:t>_</w:t>
+            </w:r>
+            <w:r>
+              <w:rPr>
+                <w:rFonts w:ascii="Arial" w:hAnsi="Arial" w:cs="Arial"/>
+                <w:sz w:val="22"/>
+                <w:szCs w:val="22"/>
+              </w:rPr>
+              <w:t xml:space="preserve"> </w:t>
+            </w:r>
+            <w:proofErr w:type="spellStart"/>
+            <w:r>
+              <w:rPr>
+                <w:rFonts w:ascii="Arial" w:hAnsi="Arial" w:cs="Arial"/>
+                <w:sz w:val="22"/>
+                <w:szCs w:val="22"/>
+              </w:rPr>
+              <w:t>ultimo_convenio</w:t>
+            </w:r>
+            <w:r>
+              <w:rPr>
+                <w:rFonts w:ascii="Arial" w:hAnsi="Arial" w:cs="Arial"/>
+                <w:sz w:val="22"/>
+                <w:szCs w:val="22"/>
+              </w:rPr>
+              <w:t>_</w:t>
+            </w:r>
+            <w:r>
+              <w:rPr>
+                <w:rFonts w:ascii="Arial" w:hAnsi="Arial" w:cs="Arial"/>
+                <w:sz w:val="22"/>
+                <w:szCs w:val="22"/>
+              </w:rPr>
+              <w:t>merienda_domingo</w:t>
             </w:r>
             <w:proofErr w:type="spellEnd"/>
             <w:r>
@@ -3843,7 +4919,51 @@
                 <w:sz w:val="22"/>
                 <w:szCs w:val="22"/>
               </w:rPr>
-              <w:t>informe.aprobadas_cena_domingo</w:t>
+              <w:t>informe.aprobadas</w:t>
+            </w:r>
+            <w:proofErr w:type="spellEnd"/>
+            <w:r>
+              <w:rPr>
+                <w:rFonts w:ascii="Arial" w:hAnsi="Arial" w:cs="Arial"/>
+                <w:sz w:val="22"/>
+                <w:szCs w:val="22"/>
+              </w:rPr>
+              <w:t>_</w:t>
+            </w:r>
+            <w:r>
+              <w:rPr>
+                <w:rFonts w:ascii="Arial" w:hAnsi="Arial" w:cs="Arial"/>
+                <w:sz w:val="22"/>
+                <w:szCs w:val="22"/>
+              </w:rPr>
+              <w:t xml:space="preserve"> </w:t>
+            </w:r>
+            <w:proofErr w:type="spellStart"/>
+            <w:r>
+              <w:rPr>
+                <w:rFonts w:ascii="Arial" w:hAnsi="Arial" w:cs="Arial"/>
+                <w:sz w:val="22"/>
+                <w:szCs w:val="22"/>
+              </w:rPr>
+              <w:t>ultimo_convenio</w:t>
+            </w:r>
+            <w:r>
+              <w:rPr>
+                <w:rFonts w:ascii="Arial" w:hAnsi="Arial" w:cs="Arial"/>
+                <w:sz w:val="22"/>
+                <w:szCs w:val="22"/>
+              </w:rPr>
+              <w:t>_</w:t>
+            </w:r>
+            <w:bookmarkStart w:id="0" w:name="_GoBack"/>
+            <w:bookmarkEnd w:id="0"/>
+            <w:r>
+              <w:rPr>
+                <w:rFonts w:ascii="Arial" w:hAnsi="Arial" w:cs="Arial"/>
+                <w:sz w:val="22"/>
+                <w:szCs w:val="22"/>
+              </w:rPr>
+              <w:t>cena_domingo</w:t>
             </w:r>
             <w:proofErr w:type="spellEnd"/>
             <w:r>
@@ -4383,6 +5503,7 @@
                 <w:sz w:val="22"/>
                 <w:szCs w:val="22"/>
               </w:rPr>
+              <w:lastRenderedPageBreak/>
               <w:t>4</w:t>
             </w:r>
           </w:p>
@@ -4784,7 +5905,6 @@
           <w:sz w:val="22"/>
           <w:szCs w:val="22"/>
         </w:rPr>
-        <w:lastRenderedPageBreak/>
         <w:t>Co</w:t>
       </w:r>
       <w:r>
@@ -5461,7 +6581,16 @@
           <w:sz w:val="22"/>
           <w:szCs w:val="22"/>
         </w:rPr>
-        <w:t>{{ informe</w:t>
+        <w:t xml:space="preserve">{{ </w:t>
+      </w:r>
+      <w:proofErr w:type="spellStart"/>
+      <w:r>
+        <w:rPr>
+          <w:rFonts w:ascii="Arial" w:hAnsi="Arial" w:cs="Arial"/>
+          <w:sz w:val="22"/>
+          <w:szCs w:val="22"/>
+        </w:rPr>
+        <w:t>informe</w:t>
       </w:r>
       <w:proofErr w:type="gramEnd"/>
       <w:r>
@@ -5480,8 +6609,7 @@
         </w:rPr>
         <w:t>_entidad</w:t>
       </w:r>
-      <w:bookmarkStart w:id="0" w:name="_GoBack"/>
-      <w:bookmarkEnd w:id="0"/>
+      <w:proofErr w:type="spellEnd"/>
       <w:r>
         <w:rPr>
           <w:rFonts w:ascii="Arial" w:hAnsi="Arial" w:cs="Arial"/>
@@ -5506,7 +6634,16 @@
           <w:sz w:val="22"/>
           <w:szCs w:val="22"/>
         </w:rPr>
-        <w:t xml:space="preserve"> }}" ratifica la voluntad de inscribirse en el Registro Voluntario de Simples Asociaciones de la Inspección General de Justicia o en el Registro correspondiente a su Jurisdicción conforme </w:t>
+        <w:t xml:space="preserve"> }}" ratifica la voluntad de inscribirse en el Registro Voluntario de </w:t>
+      </w:r>
+      <w:r>
+        <w:rPr>
+          <w:rFonts w:ascii="Arial" w:hAnsi="Arial" w:cs="Arial"/>
+          <w:sz w:val="22"/>
+          <w:szCs w:val="22"/>
+        </w:rPr>
+        <w:lastRenderedPageBreak/>
+        <w:t xml:space="preserve">Simples Asociaciones de la Inspección General de Justicia o en el Registro correspondiente a su Jurisdicción conforme </w:t>
       </w:r>
       <w:r>
         <w:rPr>
@@ -5846,16 +6983,7 @@
           <w:sz w:val="22"/>
           <w:szCs w:val="22"/>
         </w:rPr>
-        <w:t xml:space="preserve"> }}" al Programa “Alimentar Comunidad” con el fin de fortalecer la tarea realizada a favor de las familias en situación de vulnerabilidad. La población destinataria se </w:t>
-      </w:r>
-      <w:r>
-        <w:rPr>
-          <w:rFonts w:ascii="Arial" w:hAnsi="Arial" w:cs="Arial"/>
-          <w:sz w:val="22"/>
-          <w:szCs w:val="22"/>
-        </w:rPr>
-        <w:lastRenderedPageBreak/>
-        <w:t xml:space="preserve">encuentra ubicada en el Partido/Departamento de </w:t>
+        <w:t xml:space="preserve"> }}" al Programa “Alimentar Comunidad” con el fin de fortalecer la tarea realizada a favor de las familias en situación de vulnerabilidad. La población destinataria se encuentra ubicada en el Partido/Departamento de </w:t>
       </w:r>
       <w:proofErr w:type="gramStart"/>
       <w:r>
@@ -7196,6 +8324,7 @@
                 <w:sz w:val="22"/>
                 <w:szCs w:val="22"/>
               </w:rPr>
+              <w:lastRenderedPageBreak/>
               <w:t>Sábado</w:t>
             </w:r>
           </w:p>
@@ -7718,7 +8847,6 @@
                 <w:sz w:val="22"/>
                 <w:szCs w:val="22"/>
               </w:rPr>
-              <w:lastRenderedPageBreak/>
               <w:t>Se aclara que el objetivo del Formulario de Visita de Seguimiento, incorporado en las presentes actuaciones, es verificar in situ que el espacio continúa en funcionamiento y brindando asistencia alimentaria a la población objetivo del comedor/merendero en cuestión. Asimismo, se deja constancia que la información allí consignada no constituye el único insumo considerado para determinar la continuidad del financiamiento solicitado ni para evaluar las cantidades a renovar.</w:t>
             </w:r>
           </w:p>
@@ -7897,6 +9025,7 @@
           <w:sz w:val="22"/>
           <w:szCs w:val="22"/>
         </w:rPr>
+        <w:lastRenderedPageBreak/>
         <w:t>Por los fundamentos expuestos y conforme a los lineamientos técnicos y programáticos del Programa, se considera procedente la continuidad del financiamiento solicitado, por un período de seis (6) meses, contados a partir de la primera acreditación correspondiente al nuevo convenio.</w:t>
       </w:r>
     </w:p>
@@ -8040,7 +9169,7 @@
         <w:szCs w:val="22"/>
         <w:lang w:val="es-ES"/>
       </w:rPr>
-      <w:t>6</w:t>
+      <w:t>7</w:t>
     </w:r>
     <w:r>
       <w:rPr>
@@ -8091,7 +9220,7 @@
         <w:szCs w:val="22"/>
         <w:lang w:val="es-ES"/>
       </w:rPr>
-      <w:t>6</w:t>
+      <w:t>7</w:t>
     </w:r>
     <w:r>
       <w:rPr>
@@ -9410,7 +10539,7 @@
 </file>
 
 <file path=customXml/itemProps1.xml><?xml version="1.0" encoding="utf-8"?>
-<ds:datastoreItem xmlns:ds="http://schemas.openxmlformats.org/officeDocument/2006/customXml" ds:itemID="{4B9AE10B-4349-45D5-A54C-D576B9B3F676}">
+<ds:datastoreItem xmlns:ds="http://schemas.openxmlformats.org/officeDocument/2006/customXml" ds:itemID="{1A33437E-5387-45C2-8C5E-1F6555A85F7E}">
   <ds:schemaRefs>
     <ds:schemaRef ds:uri="http://schemas.openxmlformats.org/officeDocument/2006/bibliography"/>
   </ds:schemaRefs>

</xml_diff>

<commit_message>
feat(admisiones): implementar mejoras de informes alimentar
</commit_message>
<xml_diff>
--- a/admisiones/templates/admisiones/docx/renovacion_docx_informe_tecnico_base.docx
+++ b/admisiones/templates/admisiones/docx/renovacion_docx_informe_tecnico_base.docx
@@ -8,8 +8,6 @@
       </w:pPr>
       <w:r>
         <w:tab/>
-      </w:r>
-      <w:r>
         <w:tab/>
       </w:r>
     </w:p>
@@ -118,12 +116,6 @@
           <w:szCs w:val="22"/>
         </w:rPr>
         <w:t>En ese marco, es necesario realizar un trabajo conjunto y articulado con el fin de implementar dicho Programa para complementar la cobertura de las necesidades alimentarias para la población asistida.</w:t>
-      </w:r>
-      <w:r>
-        <w:rPr>
-          <w:sz w:val="22"/>
-          <w:szCs w:val="22"/>
-        </w:rPr>
         <w:br/>
       </w:r>
       <w:r>
@@ -132,55 +124,7 @@
           <w:sz w:val="22"/>
           <w:szCs w:val="22"/>
         </w:rPr>
-        <w:t>La Organización {{ informe.admision.comedor.organizacion.subtip</w:t>
-      </w:r>
-      <w:r>
-        <w:rPr>
-          <w:rFonts w:ascii="Arial" w:hAnsi="Arial" w:cs="Arial"/>
-          <w:sz w:val="22"/>
-          <w:szCs w:val="22"/>
-        </w:rPr>
-        <w:t>o_entidad</w:t>
-      </w:r>
-      <w:r>
-        <w:rPr>
-          <w:rFonts w:ascii="Arial" w:hAnsi="Arial" w:cs="Arial"/>
-          <w:sz w:val="22"/>
-          <w:szCs w:val="22"/>
-        </w:rPr>
-        <w:t xml:space="preserve"> }} "{{ informe.nombre_organizacion }}" solicita la </w:t>
-      </w:r>
-      <w:r>
-        <w:rPr>
-          <w:rFonts w:ascii="Arial" w:hAnsi="Arial" w:cs="Arial"/>
-          <w:sz w:val="22"/>
-          <w:szCs w:val="22"/>
-        </w:rPr>
-        <w:t xml:space="preserve">continuidad del financiamiento del complemento de los servicios alimentarios brindado en el </w:t>
-      </w:r>
-      <w:r>
-        <w:rPr>
-          <w:rFonts w:ascii="Arial" w:hAnsi="Arial" w:cs="Arial"/>
-          <w:sz w:val="22"/>
-          <w:szCs w:val="22"/>
-        </w:rPr>
-        <w:t xml:space="preserve">{{ informe.tipo_espacio }} “{{ informe.nombre_espacio }}” </w:t>
-      </w:r>
-      <w:r>
-        <w:rPr>
-          <w:rFonts w:ascii="Arial" w:hAnsi="Arial" w:cs="Arial"/>
-          <w:sz w:val="22"/>
-          <w:szCs w:val="22"/>
-        </w:rPr>
-        <w:t>con el fin de continuar fortaleciendo las tareas realizadas, conforme nota identificada como</w:t>
-      </w:r>
-      <w:r>
-        <w:rPr>
-          <w:rFonts w:ascii="Arial" w:hAnsi="Arial" w:cs="Arial"/>
-          <w:sz w:val="22"/>
-          <w:szCs w:val="22"/>
-        </w:rPr>
-        <w:t xml:space="preserve"> {{ informe.nota_gde_if }}.</w:t>
+        <w:t>La Organización {{ informe.admision.comedor.organizacion.subtipo_entidad }} "{{ informe.nombre_organizacion }}" solicita la continuidad del financiamiento del complemento de los servicios alimentarios brindado en el {{ informe.tipo_espacio }} “{{ informe.nombre_espacio }}” con el fin de continuar fortaleciendo las tareas realizadas, conforme nota identificada como {{ informe.nota_gde_if }}.</w:t>
       </w:r>
     </w:p>
     <w:p>
@@ -1546,47 +1490,7 @@
           <w:sz w:val="22"/>
           <w:szCs w:val="22"/>
         </w:rPr>
-        <w:t>Que por Resolución XXXXXXXXXX se incorporó al Programa “Alimentar Comunidad” el</w:t>
-      </w:r>
-      <w:r>
-        <w:rPr>
-          <w:rFonts w:ascii="Arial" w:hAnsi="Arial" w:cs="Arial"/>
-          <w:sz w:val="22"/>
-          <w:szCs w:val="22"/>
-        </w:rPr>
-        <w:t xml:space="preserve"> {{ informe.tipo_espacio }} {{ informe.nombre_espacio }} </w:t>
-      </w:r>
-      <w:r>
-        <w:rPr>
-          <w:rFonts w:ascii="Arial" w:hAnsi="Arial" w:cs="Arial"/>
-          <w:sz w:val="22"/>
-          <w:szCs w:val="22"/>
-        </w:rPr>
-        <w:t xml:space="preserve">ubicado en </w:t>
-      </w:r>
-      <w:r>
-        <w:rPr>
-          <w:rFonts w:ascii="Arial" w:hAnsi="Arial" w:cs="Arial"/>
-          <w:sz w:val="22"/>
-          <w:szCs w:val="22"/>
-        </w:rPr>
-        <w:t>{{ informe.domicilio_espacio }}</w:t>
-      </w:r>
-      <w:r>
-        <w:rPr>
-          <w:rFonts w:ascii="Arial" w:hAnsi="Arial" w:cs="Arial"/>
-          <w:sz w:val="22"/>
-          <w:szCs w:val="22"/>
-        </w:rPr>
-        <w:t xml:space="preserve"> y se aprobó el Convenio de Ejecución oportunamente suscripto mediante el cual </w:t>
-      </w:r>
-      <w:r>
-        <w:rPr>
-          <w:rFonts w:ascii="Arial" w:hAnsi="Arial" w:cs="Arial"/>
-          <w:sz w:val="22"/>
-          <w:szCs w:val="22"/>
-        </w:rPr>
-        <w:t>se especificaron la modalidad de ejecución, el financiamiento, el plazo de ejecución, las formalidades de rendición de cuentas y de información de gestión social y otras obligaciones que resultan aplicables.</w:t>
+        <w:t>Que por Resolución XXXXXXXXXX se incorporó al Programa “Alimentar Comunidad” el {{ informe.tipo_espacio }} {{ informe.nombre_espacio }} ubicado en {{ informe.domicilio_espacio }} y se aprobó el Convenio de Ejecución oportunamente suscripto mediante el cual se especificaron la modalidad de ejecución, el financiamiento, el plazo de ejecución, las formalidades de rendición de cuentas y de información de gestión social y otras obligaciones que resultan aplicables.</w:t>
       </w:r>
     </w:p>
     <w:p>
@@ -1831,23 +1735,7 @@
                 <w:sz w:val="22"/>
                 <w:szCs w:val="22"/>
               </w:rPr>
-              <w:t>{{ informe.aprobadas</w:t>
-            </w:r>
-            <w:r>
-              <w:rPr>
-                <w:rFonts w:ascii="Arial" w:hAnsi="Arial" w:cs="Arial"/>
-                <w:sz w:val="22"/>
-                <w:szCs w:val="22"/>
-              </w:rPr>
-              <w:t>_ultimo_convenio</w:t>
-            </w:r>
-            <w:r>
-              <w:rPr>
-                <w:rFonts w:ascii="Arial" w:hAnsi="Arial" w:cs="Arial"/>
-                <w:sz w:val="22"/>
-                <w:szCs w:val="22"/>
-              </w:rPr>
-              <w:t>_desayuno_lunes }}</w:t>
+              <w:t>{{ informe.aprobadas_ultimo_convenio_desayuno_lunes }}</w:t>
             </w:r>
           </w:p>
         </w:tc>
@@ -2671,894 +2559,6 @@
         <w:jc w:val="both"/>
         <w:rPr>
           <w:rFonts w:ascii="Arial" w:hAnsi="Arial" w:cs="Arial"/>
-          <w:sz w:val="22"/>
-          <w:szCs w:val="22"/>
-        </w:rPr>
-      </w:pPr>
-      <w:r>
-        <w:rPr>
-          <w:rFonts w:ascii="Arial" w:hAnsi="Arial" w:cs="Arial"/>
-          <w:sz w:val="22"/>
-          <w:szCs w:val="22"/>
-        </w:rPr>
-        <w:t>Para el financiamiento de dichas prestaciones se realizaron seis (6) acreditaciones conforme el siguiente cronograma:</w:t>
-      </w:r>
-    </w:p>
-    <w:tbl>
-      <w:tblPr>
-        <w:tblStyle w:val="Tablaconcuadrcula"/>
-        <w:tblW w:w="5000" w:type="pct"/>
-        <w:tblLook w:val="04A0" w:firstRow="1" w:lastRow="0" w:firstColumn="1" w:lastColumn="0" w:noHBand="0" w:noVBand="1"/>
-      </w:tblPr>
-      <w:tblGrid>
-        <w:gridCol w:w="2122"/>
-        <w:gridCol w:w="3684"/>
-        <w:gridCol w:w="3544"/>
-      </w:tblGrid>
-      <w:tr>
-        <w:trPr>
-          <w:trHeight w:val="703"/>
-        </w:trPr>
-        <w:tc>
-          <w:tcPr>
-            <w:tcW w:w="1135" w:type="pct"/>
-            <w:shd w:val="clear" w:color="auto" w:fill="000000" w:themeFill="text1"/>
-            <w:vAlign w:val="center"/>
-          </w:tcPr>
-          <w:p>
-            <w:pPr>
-              <w:pStyle w:val="Prrafodelista"/>
-              <w:ind w:left="0"/>
-              <w:rPr>
-                <w:rFonts w:ascii="Arial" w:hAnsi="Arial" w:cs="Arial"/>
-                <w:b/>
-                <w:color w:val="FFFFFF" w:themeColor="background1"/>
-                <w:sz w:val="22"/>
-                <w:szCs w:val="22"/>
-              </w:rPr>
-            </w:pPr>
-            <w:r>
-              <w:rPr>
-                <w:rFonts w:ascii="Arial" w:hAnsi="Arial" w:cs="Arial"/>
-                <w:b/>
-                <w:color w:val="FFFFFF" w:themeColor="background1"/>
-                <w:sz w:val="22"/>
-                <w:szCs w:val="22"/>
-              </w:rPr>
-              <w:t>Acreditación</w:t>
-            </w:r>
-          </w:p>
-        </w:tc>
-        <w:tc>
-          <w:tcPr>
-            <w:tcW w:w="1970" w:type="pct"/>
-            <w:shd w:val="clear" w:color="auto" w:fill="000000" w:themeFill="text1"/>
-            <w:vAlign w:val="center"/>
-          </w:tcPr>
-          <w:p>
-            <w:pPr>
-              <w:pStyle w:val="Prrafodelista"/>
-              <w:ind w:left="0"/>
-              <w:jc w:val="center"/>
-              <w:rPr>
-                <w:rFonts w:ascii="Arial" w:hAnsi="Arial" w:cs="Arial"/>
-                <w:b/>
-                <w:color w:val="FFFFFF" w:themeColor="background1"/>
-                <w:sz w:val="22"/>
-                <w:szCs w:val="22"/>
-              </w:rPr>
-            </w:pPr>
-            <w:r>
-              <w:rPr>
-                <w:rFonts w:ascii="Arial" w:hAnsi="Arial" w:cs="Arial"/>
-                <w:b/>
-                <w:color w:val="FFFFFF" w:themeColor="background1"/>
-                <w:sz w:val="22"/>
-                <w:szCs w:val="22"/>
-              </w:rPr>
-              <w:t>RESOLUCIÓN</w:t>
-            </w:r>
-          </w:p>
-        </w:tc>
-        <w:tc>
-          <w:tcPr>
-            <w:tcW w:w="1895" w:type="pct"/>
-            <w:shd w:val="clear" w:color="auto" w:fill="000000" w:themeFill="text1"/>
-            <w:vAlign w:val="center"/>
-          </w:tcPr>
-          <w:p>
-            <w:pPr>
-              <w:pStyle w:val="Prrafodelista"/>
-              <w:ind w:left="0"/>
-              <w:jc w:val="center"/>
-              <w:rPr>
-                <w:rFonts w:ascii="Arial" w:hAnsi="Arial" w:cs="Arial"/>
-                <w:b/>
-                <w:color w:val="FFFFFF" w:themeColor="background1"/>
-                <w:sz w:val="22"/>
-                <w:szCs w:val="22"/>
-              </w:rPr>
-            </w:pPr>
-            <w:r>
-              <w:rPr>
-                <w:rFonts w:ascii="Arial" w:hAnsi="Arial" w:cs="Arial"/>
-                <w:b/>
-                <w:color w:val="FFFFFF" w:themeColor="background1"/>
-                <w:sz w:val="22"/>
-                <w:szCs w:val="22"/>
-              </w:rPr>
-              <w:t>MONTO</w:t>
-            </w:r>
-          </w:p>
-        </w:tc>
-      </w:tr>
-      <w:tr>
-        <w:trPr>
-          <w:trHeight w:val="703"/>
-        </w:trPr>
-        <w:tc>
-          <w:tcPr>
-            <w:tcW w:w="1135" w:type="pct"/>
-            <w:vAlign w:val="center"/>
-          </w:tcPr>
-          <w:p>
-            <w:pPr>
-              <w:pStyle w:val="Prrafodelista"/>
-              <w:ind w:left="0"/>
-              <w:rPr>
-                <w:rFonts w:ascii="Arial" w:hAnsi="Arial" w:cs="Arial"/>
-                <w:sz w:val="22"/>
-                <w:szCs w:val="22"/>
-              </w:rPr>
-            </w:pPr>
-            <w:r>
-              <w:rPr>
-                <w:rFonts w:ascii="Arial" w:hAnsi="Arial" w:cs="Arial"/>
-                <w:sz w:val="22"/>
-                <w:szCs w:val="22"/>
-              </w:rPr>
-              <w:t>1</w:t>
-            </w:r>
-          </w:p>
-        </w:tc>
-        <w:tc>
-          <w:tcPr>
-            <w:tcW w:w="1970" w:type="pct"/>
-            <w:vAlign w:val="center"/>
-          </w:tcPr>
-          <w:p>
-            <w:pPr>
-              <w:pStyle w:val="Prrafodelista"/>
-              <w:ind w:left="0"/>
-              <w:jc w:val="center"/>
-              <w:rPr>
-                <w:rFonts w:ascii="Arial" w:hAnsi="Arial" w:cs="Arial"/>
-                <w:sz w:val="22"/>
-                <w:szCs w:val="22"/>
-              </w:rPr>
-            </w:pPr>
-            <w:r>
-              <w:rPr>
-                <w:rFonts w:ascii="Arial" w:hAnsi="Arial" w:cs="Arial"/>
-                <w:sz w:val="22"/>
-                <w:szCs w:val="22"/>
-              </w:rPr>
-              <w:t>{{ informe.</w:t>
-            </w:r>
-            <w:r>
-              <w:rPr>
-                <w:rFonts w:ascii="Arial" w:hAnsi="Arial" w:cs="Arial"/>
-                <w:sz w:val="22"/>
-                <w:szCs w:val="22"/>
-              </w:rPr>
-              <w:t>resolucion_de_pago_1</w:t>
-            </w:r>
-            <w:r>
-              <w:rPr>
-                <w:rFonts w:ascii="Arial" w:hAnsi="Arial" w:cs="Arial"/>
-                <w:sz w:val="22"/>
-                <w:szCs w:val="22"/>
-              </w:rPr>
-              <w:t xml:space="preserve"> }}</w:t>
-            </w:r>
-          </w:p>
-        </w:tc>
-        <w:tc>
-          <w:tcPr>
-            <w:tcW w:w="1895" w:type="pct"/>
-            <w:vAlign w:val="center"/>
-          </w:tcPr>
-          <w:p>
-            <w:pPr>
-              <w:pStyle w:val="Prrafodelista"/>
-              <w:ind w:left="0"/>
-              <w:jc w:val="center"/>
-              <w:rPr>
-                <w:rFonts w:ascii="Arial" w:hAnsi="Arial" w:cs="Arial"/>
-                <w:sz w:val="22"/>
-                <w:szCs w:val="22"/>
-              </w:rPr>
-            </w:pPr>
-            <w:r>
-              <w:rPr>
-                <w:rFonts w:ascii="Arial" w:hAnsi="Arial" w:cs="Arial"/>
-                <w:sz w:val="22"/>
-                <w:szCs w:val="22"/>
-              </w:rPr>
-              <w:t>{{ informe.</w:t>
-            </w:r>
-            <w:r>
-              <w:rPr>
-                <w:rFonts w:ascii="Arial" w:hAnsi="Arial" w:cs="Arial"/>
-                <w:sz w:val="22"/>
-                <w:szCs w:val="22"/>
-              </w:rPr>
-              <w:t>monto_</w:t>
-            </w:r>
-            <w:r>
-              <w:rPr>
-                <w:rFonts w:ascii="Arial" w:hAnsi="Arial" w:cs="Arial"/>
-                <w:sz w:val="22"/>
-                <w:szCs w:val="22"/>
-              </w:rPr>
-              <w:t>1</w:t>
-            </w:r>
-            <w:r>
-              <w:rPr>
-                <w:rFonts w:ascii="Arial" w:hAnsi="Arial" w:cs="Arial"/>
-                <w:sz w:val="22"/>
-                <w:szCs w:val="22"/>
-              </w:rPr>
-              <w:t xml:space="preserve"> }}</w:t>
-            </w:r>
-          </w:p>
-        </w:tc>
-      </w:tr>
-      <w:tr>
-        <w:trPr>
-          <w:trHeight w:val="703"/>
-        </w:trPr>
-        <w:tc>
-          <w:tcPr>
-            <w:tcW w:w="1135" w:type="pct"/>
-            <w:vAlign w:val="center"/>
-          </w:tcPr>
-          <w:p>
-            <w:pPr>
-              <w:pStyle w:val="Prrafodelista"/>
-              <w:ind w:left="0"/>
-              <w:rPr>
-                <w:rFonts w:ascii="Arial" w:hAnsi="Arial" w:cs="Arial"/>
-                <w:sz w:val="22"/>
-                <w:szCs w:val="22"/>
-              </w:rPr>
-            </w:pPr>
-            <w:r>
-              <w:rPr>
-                <w:rFonts w:ascii="Arial" w:hAnsi="Arial" w:cs="Arial"/>
-                <w:sz w:val="22"/>
-                <w:szCs w:val="22"/>
-              </w:rPr>
-              <w:t>2</w:t>
-            </w:r>
-          </w:p>
-        </w:tc>
-        <w:tc>
-          <w:tcPr>
-            <w:tcW w:w="1970" w:type="pct"/>
-            <w:vAlign w:val="center"/>
-          </w:tcPr>
-          <w:p>
-            <w:pPr>
-              <w:pStyle w:val="Prrafodelista"/>
-              <w:ind w:left="0"/>
-              <w:jc w:val="center"/>
-              <w:rPr>
-                <w:rFonts w:ascii="Arial" w:hAnsi="Arial" w:cs="Arial"/>
-                <w:sz w:val="22"/>
-                <w:szCs w:val="22"/>
-              </w:rPr>
-            </w:pPr>
-            <w:r>
-              <w:rPr>
-                <w:rFonts w:ascii="Arial" w:hAnsi="Arial" w:cs="Arial"/>
-                <w:sz w:val="22"/>
-                <w:szCs w:val="22"/>
-              </w:rPr>
-              <w:t>{{ informe.</w:t>
-            </w:r>
-            <w:r>
-              <w:rPr>
-                <w:rFonts w:ascii="Arial" w:hAnsi="Arial" w:cs="Arial"/>
-                <w:sz w:val="22"/>
-                <w:szCs w:val="22"/>
-              </w:rPr>
-              <w:t>resolucion_de_pago_</w:t>
-            </w:r>
-            <w:r>
-              <w:rPr>
-                <w:rFonts w:ascii="Arial" w:hAnsi="Arial" w:cs="Arial"/>
-                <w:sz w:val="22"/>
-                <w:szCs w:val="22"/>
-              </w:rPr>
-              <w:t>2</w:t>
-            </w:r>
-            <w:r>
-              <w:rPr>
-                <w:rFonts w:ascii="Arial" w:hAnsi="Arial" w:cs="Arial"/>
-                <w:sz w:val="22"/>
-                <w:szCs w:val="22"/>
-              </w:rPr>
-              <w:t xml:space="preserve"> }}</w:t>
-            </w:r>
-          </w:p>
-        </w:tc>
-        <w:tc>
-          <w:tcPr>
-            <w:tcW w:w="1895" w:type="pct"/>
-            <w:vAlign w:val="center"/>
-          </w:tcPr>
-          <w:p>
-            <w:pPr>
-              <w:pStyle w:val="Prrafodelista"/>
-              <w:ind w:left="0"/>
-              <w:jc w:val="center"/>
-              <w:rPr>
-                <w:rFonts w:ascii="Arial" w:hAnsi="Arial" w:cs="Arial"/>
-                <w:sz w:val="22"/>
-                <w:szCs w:val="22"/>
-              </w:rPr>
-            </w:pPr>
-            <w:r>
-              <w:rPr>
-                <w:rFonts w:ascii="Arial" w:hAnsi="Arial" w:cs="Arial"/>
-                <w:sz w:val="22"/>
-                <w:szCs w:val="22"/>
-              </w:rPr>
-              <w:t>{{ informe.</w:t>
-            </w:r>
-            <w:r>
-              <w:rPr>
-                <w:rFonts w:ascii="Arial" w:hAnsi="Arial" w:cs="Arial"/>
-                <w:sz w:val="22"/>
-                <w:szCs w:val="22"/>
-              </w:rPr>
-              <w:t>monto_2</w:t>
-            </w:r>
-            <w:r>
-              <w:rPr>
-                <w:rFonts w:ascii="Arial" w:hAnsi="Arial" w:cs="Arial"/>
-                <w:sz w:val="22"/>
-                <w:szCs w:val="22"/>
-              </w:rPr>
-              <w:t xml:space="preserve"> }}</w:t>
-            </w:r>
-          </w:p>
-        </w:tc>
-      </w:tr>
-      <w:tr>
-        <w:trPr>
-          <w:trHeight w:val="703"/>
-        </w:trPr>
-        <w:tc>
-          <w:tcPr>
-            <w:tcW w:w="1135" w:type="pct"/>
-            <w:vAlign w:val="center"/>
-          </w:tcPr>
-          <w:p>
-            <w:pPr>
-              <w:pStyle w:val="Prrafodelista"/>
-              <w:ind w:left="0"/>
-              <w:rPr>
-                <w:rFonts w:ascii="Arial" w:hAnsi="Arial" w:cs="Arial"/>
-                <w:sz w:val="22"/>
-                <w:szCs w:val="22"/>
-              </w:rPr>
-            </w:pPr>
-            <w:r>
-              <w:rPr>
-                <w:rFonts w:ascii="Arial" w:hAnsi="Arial" w:cs="Arial"/>
-                <w:sz w:val="22"/>
-                <w:szCs w:val="22"/>
-              </w:rPr>
-              <w:t>3</w:t>
-            </w:r>
-          </w:p>
-        </w:tc>
-        <w:tc>
-          <w:tcPr>
-            <w:tcW w:w="1970" w:type="pct"/>
-            <w:vAlign w:val="center"/>
-          </w:tcPr>
-          <w:p>
-            <w:pPr>
-              <w:pStyle w:val="Prrafodelista"/>
-              <w:ind w:left="0"/>
-              <w:jc w:val="center"/>
-              <w:rPr>
-                <w:rFonts w:ascii="Arial" w:hAnsi="Arial" w:cs="Arial"/>
-                <w:sz w:val="22"/>
-                <w:szCs w:val="22"/>
-              </w:rPr>
-            </w:pPr>
-            <w:r>
-              <w:rPr>
-                <w:rFonts w:ascii="Arial" w:hAnsi="Arial" w:cs="Arial"/>
-                <w:sz w:val="22"/>
-                <w:szCs w:val="22"/>
-              </w:rPr>
-              <w:t>{{ informe.</w:t>
-            </w:r>
-            <w:r>
-              <w:rPr>
-                <w:rFonts w:ascii="Arial" w:hAnsi="Arial" w:cs="Arial"/>
-                <w:sz w:val="22"/>
-                <w:szCs w:val="22"/>
-              </w:rPr>
-              <w:t>resolucion_de_pago_</w:t>
-            </w:r>
-            <w:r>
-              <w:rPr>
-                <w:rFonts w:ascii="Arial" w:hAnsi="Arial" w:cs="Arial"/>
-                <w:sz w:val="22"/>
-                <w:szCs w:val="22"/>
-              </w:rPr>
-              <w:t>3</w:t>
-            </w:r>
-            <w:r>
-              <w:rPr>
-                <w:rFonts w:ascii="Arial" w:hAnsi="Arial" w:cs="Arial"/>
-                <w:sz w:val="22"/>
-                <w:szCs w:val="22"/>
-              </w:rPr>
-              <w:t xml:space="preserve"> }}</w:t>
-            </w:r>
-          </w:p>
-        </w:tc>
-        <w:tc>
-          <w:tcPr>
-            <w:tcW w:w="1895" w:type="pct"/>
-            <w:vAlign w:val="center"/>
-          </w:tcPr>
-          <w:p>
-            <w:pPr>
-              <w:pStyle w:val="Prrafodelista"/>
-              <w:ind w:left="0"/>
-              <w:jc w:val="center"/>
-              <w:rPr>
-                <w:rFonts w:ascii="Arial" w:hAnsi="Arial" w:cs="Arial"/>
-                <w:sz w:val="22"/>
-                <w:szCs w:val="22"/>
-              </w:rPr>
-            </w:pPr>
-            <w:r>
-              <w:rPr>
-                <w:rFonts w:ascii="Arial" w:hAnsi="Arial" w:cs="Arial"/>
-                <w:sz w:val="22"/>
-                <w:szCs w:val="22"/>
-              </w:rPr>
-              <w:t>{{ informe.</w:t>
-            </w:r>
-            <w:r>
-              <w:rPr>
-                <w:rFonts w:ascii="Arial" w:hAnsi="Arial" w:cs="Arial"/>
-                <w:sz w:val="22"/>
-                <w:szCs w:val="22"/>
-              </w:rPr>
-              <w:t>monto_3</w:t>
-            </w:r>
-            <w:r>
-              <w:rPr>
-                <w:rFonts w:ascii="Arial" w:hAnsi="Arial" w:cs="Arial"/>
-                <w:sz w:val="22"/>
-                <w:szCs w:val="22"/>
-              </w:rPr>
-              <w:t xml:space="preserve"> }}</w:t>
-            </w:r>
-          </w:p>
-        </w:tc>
-      </w:tr>
-      <w:tr>
-        <w:trPr>
-          <w:trHeight w:val="703"/>
-        </w:trPr>
-        <w:tc>
-          <w:tcPr>
-            <w:tcW w:w="1135" w:type="pct"/>
-            <w:vAlign w:val="center"/>
-          </w:tcPr>
-          <w:p>
-            <w:pPr>
-              <w:pStyle w:val="Prrafodelista"/>
-              <w:ind w:left="0"/>
-              <w:rPr>
-                <w:rFonts w:ascii="Arial" w:hAnsi="Arial" w:cs="Arial"/>
-                <w:sz w:val="22"/>
-                <w:szCs w:val="22"/>
-              </w:rPr>
-            </w:pPr>
-            <w:r>
-              <w:rPr>
-                <w:rFonts w:ascii="Arial" w:hAnsi="Arial" w:cs="Arial"/>
-                <w:sz w:val="22"/>
-                <w:szCs w:val="22"/>
-              </w:rPr>
-              <w:lastRenderedPageBreak/>
-              <w:t>4</w:t>
-            </w:r>
-          </w:p>
-        </w:tc>
-        <w:tc>
-          <w:tcPr>
-            <w:tcW w:w="1970" w:type="pct"/>
-            <w:vAlign w:val="center"/>
-          </w:tcPr>
-          <w:p>
-            <w:pPr>
-              <w:pStyle w:val="Prrafodelista"/>
-              <w:ind w:left="0"/>
-              <w:jc w:val="center"/>
-              <w:rPr>
-                <w:rFonts w:ascii="Arial" w:hAnsi="Arial" w:cs="Arial"/>
-                <w:sz w:val="22"/>
-                <w:szCs w:val="22"/>
-              </w:rPr>
-            </w:pPr>
-            <w:r>
-              <w:rPr>
-                <w:rFonts w:ascii="Arial" w:hAnsi="Arial" w:cs="Arial"/>
-                <w:sz w:val="22"/>
-                <w:szCs w:val="22"/>
-              </w:rPr>
-              <w:t>{{ informe.</w:t>
-            </w:r>
-            <w:r>
-              <w:rPr>
-                <w:rFonts w:ascii="Arial" w:hAnsi="Arial" w:cs="Arial"/>
-                <w:sz w:val="22"/>
-                <w:szCs w:val="22"/>
-              </w:rPr>
-              <w:t>resolucion_de_pago_</w:t>
-            </w:r>
-            <w:r>
-              <w:rPr>
-                <w:rFonts w:ascii="Arial" w:hAnsi="Arial" w:cs="Arial"/>
-                <w:sz w:val="22"/>
-                <w:szCs w:val="22"/>
-              </w:rPr>
-              <w:t>4</w:t>
-            </w:r>
-            <w:r>
-              <w:rPr>
-                <w:rFonts w:ascii="Arial" w:hAnsi="Arial" w:cs="Arial"/>
-                <w:sz w:val="22"/>
-                <w:szCs w:val="22"/>
-              </w:rPr>
-              <w:t xml:space="preserve"> }}</w:t>
-            </w:r>
-          </w:p>
-        </w:tc>
-        <w:tc>
-          <w:tcPr>
-            <w:tcW w:w="1895" w:type="pct"/>
-            <w:vAlign w:val="center"/>
-          </w:tcPr>
-          <w:p>
-            <w:pPr>
-              <w:pStyle w:val="Prrafodelista"/>
-              <w:ind w:left="0"/>
-              <w:jc w:val="center"/>
-              <w:rPr>
-                <w:rFonts w:ascii="Arial" w:hAnsi="Arial" w:cs="Arial"/>
-                <w:sz w:val="22"/>
-                <w:szCs w:val="22"/>
-              </w:rPr>
-            </w:pPr>
-            <w:r>
-              <w:rPr>
-                <w:rFonts w:ascii="Arial" w:hAnsi="Arial" w:cs="Arial"/>
-                <w:sz w:val="22"/>
-                <w:szCs w:val="22"/>
-              </w:rPr>
-              <w:t>{{ informe.</w:t>
-            </w:r>
-            <w:r>
-              <w:rPr>
-                <w:rFonts w:ascii="Arial" w:hAnsi="Arial" w:cs="Arial"/>
-                <w:sz w:val="22"/>
-                <w:szCs w:val="22"/>
-              </w:rPr>
-              <w:t>monto_4</w:t>
-            </w:r>
-            <w:r>
-              <w:rPr>
-                <w:rFonts w:ascii="Arial" w:hAnsi="Arial" w:cs="Arial"/>
-                <w:sz w:val="22"/>
-                <w:szCs w:val="22"/>
-              </w:rPr>
-              <w:t xml:space="preserve"> }}</w:t>
-            </w:r>
-          </w:p>
-        </w:tc>
-      </w:tr>
-      <w:tr>
-        <w:trPr>
-          <w:trHeight w:val="703"/>
-        </w:trPr>
-        <w:tc>
-          <w:tcPr>
-            <w:tcW w:w="1135" w:type="pct"/>
-            <w:vAlign w:val="center"/>
-          </w:tcPr>
-          <w:p>
-            <w:pPr>
-              <w:pStyle w:val="Prrafodelista"/>
-              <w:ind w:left="0"/>
-              <w:rPr>
-                <w:rFonts w:ascii="Arial" w:hAnsi="Arial" w:cs="Arial"/>
-                <w:sz w:val="22"/>
-                <w:szCs w:val="22"/>
-              </w:rPr>
-            </w:pPr>
-            <w:r>
-              <w:rPr>
-                <w:rFonts w:ascii="Arial" w:hAnsi="Arial" w:cs="Arial"/>
-                <w:sz w:val="22"/>
-                <w:szCs w:val="22"/>
-              </w:rPr>
-              <w:t>5</w:t>
-            </w:r>
-          </w:p>
-        </w:tc>
-        <w:tc>
-          <w:tcPr>
-            <w:tcW w:w="1970" w:type="pct"/>
-            <w:vAlign w:val="center"/>
-          </w:tcPr>
-          <w:p>
-            <w:pPr>
-              <w:pStyle w:val="Prrafodelista"/>
-              <w:ind w:left="0"/>
-              <w:jc w:val="center"/>
-              <w:rPr>
-                <w:rFonts w:ascii="Arial" w:hAnsi="Arial" w:cs="Arial"/>
-                <w:sz w:val="22"/>
-                <w:szCs w:val="22"/>
-              </w:rPr>
-            </w:pPr>
-            <w:r>
-              <w:rPr>
-                <w:rFonts w:ascii="Arial" w:hAnsi="Arial" w:cs="Arial"/>
-                <w:sz w:val="22"/>
-                <w:szCs w:val="22"/>
-              </w:rPr>
-              <w:t>{{ informe.</w:t>
-            </w:r>
-            <w:r>
-              <w:rPr>
-                <w:rFonts w:ascii="Arial" w:hAnsi="Arial" w:cs="Arial"/>
-                <w:sz w:val="22"/>
-                <w:szCs w:val="22"/>
-              </w:rPr>
-              <w:t>resolucion_de_pago_</w:t>
-            </w:r>
-            <w:r>
-              <w:rPr>
-                <w:rFonts w:ascii="Arial" w:hAnsi="Arial" w:cs="Arial"/>
-                <w:sz w:val="22"/>
-                <w:szCs w:val="22"/>
-              </w:rPr>
-              <w:t xml:space="preserve">5 </w:t>
-            </w:r>
-            <w:r>
-              <w:rPr>
-                <w:rFonts w:ascii="Arial" w:hAnsi="Arial" w:cs="Arial"/>
-                <w:sz w:val="22"/>
-                <w:szCs w:val="22"/>
-              </w:rPr>
-              <w:t>}}</w:t>
-            </w:r>
-          </w:p>
-        </w:tc>
-        <w:tc>
-          <w:tcPr>
-            <w:tcW w:w="1895" w:type="pct"/>
-            <w:vAlign w:val="center"/>
-          </w:tcPr>
-          <w:p>
-            <w:pPr>
-              <w:pStyle w:val="Prrafodelista"/>
-              <w:ind w:left="0"/>
-              <w:jc w:val="center"/>
-              <w:rPr>
-                <w:rFonts w:ascii="Arial" w:hAnsi="Arial" w:cs="Arial"/>
-                <w:sz w:val="22"/>
-                <w:szCs w:val="22"/>
-              </w:rPr>
-            </w:pPr>
-            <w:r>
-              <w:rPr>
-                <w:rFonts w:ascii="Arial" w:hAnsi="Arial" w:cs="Arial"/>
-                <w:sz w:val="22"/>
-                <w:szCs w:val="22"/>
-              </w:rPr>
-              <w:t>{{ informe.</w:t>
-            </w:r>
-            <w:r>
-              <w:rPr>
-                <w:rFonts w:ascii="Arial" w:hAnsi="Arial" w:cs="Arial"/>
-                <w:sz w:val="22"/>
-                <w:szCs w:val="22"/>
-              </w:rPr>
-              <w:t>monto_5</w:t>
-            </w:r>
-            <w:r>
-              <w:rPr>
-                <w:rFonts w:ascii="Arial" w:hAnsi="Arial" w:cs="Arial"/>
-                <w:sz w:val="22"/>
-                <w:szCs w:val="22"/>
-              </w:rPr>
-              <w:t xml:space="preserve"> }}</w:t>
-            </w:r>
-          </w:p>
-        </w:tc>
-      </w:tr>
-      <w:tr>
-        <w:trPr>
-          <w:trHeight w:val="703"/>
-        </w:trPr>
-        <w:tc>
-          <w:tcPr>
-            <w:tcW w:w="1135" w:type="pct"/>
-            <w:vAlign w:val="center"/>
-          </w:tcPr>
-          <w:p>
-            <w:pPr>
-              <w:pStyle w:val="Prrafodelista"/>
-              <w:ind w:left="0"/>
-              <w:rPr>
-                <w:rFonts w:ascii="Arial" w:hAnsi="Arial" w:cs="Arial"/>
-                <w:sz w:val="22"/>
-                <w:szCs w:val="22"/>
-              </w:rPr>
-            </w:pPr>
-            <w:r>
-              <w:rPr>
-                <w:rFonts w:ascii="Arial" w:hAnsi="Arial" w:cs="Arial"/>
-                <w:sz w:val="22"/>
-                <w:szCs w:val="22"/>
-              </w:rPr>
-              <w:t>6</w:t>
-            </w:r>
-          </w:p>
-        </w:tc>
-        <w:tc>
-          <w:tcPr>
-            <w:tcW w:w="1970" w:type="pct"/>
-            <w:vAlign w:val="center"/>
-          </w:tcPr>
-          <w:p>
-            <w:pPr>
-              <w:pStyle w:val="Prrafodelista"/>
-              <w:ind w:left="0"/>
-              <w:jc w:val="center"/>
-              <w:rPr>
-                <w:rFonts w:ascii="Arial" w:hAnsi="Arial" w:cs="Arial"/>
-                <w:sz w:val="22"/>
-                <w:szCs w:val="22"/>
-              </w:rPr>
-            </w:pPr>
-            <w:r>
-              <w:rPr>
-                <w:rFonts w:ascii="Arial" w:hAnsi="Arial" w:cs="Arial"/>
-                <w:sz w:val="22"/>
-                <w:szCs w:val="22"/>
-              </w:rPr>
-              <w:t>{{ informe.</w:t>
-            </w:r>
-            <w:r>
-              <w:rPr>
-                <w:rFonts w:ascii="Arial" w:hAnsi="Arial" w:cs="Arial"/>
-                <w:sz w:val="22"/>
-                <w:szCs w:val="22"/>
-              </w:rPr>
-              <w:t>resolucion_de_pago_</w:t>
-            </w:r>
-            <w:r>
-              <w:rPr>
-                <w:rFonts w:ascii="Arial" w:hAnsi="Arial" w:cs="Arial"/>
-                <w:sz w:val="22"/>
-                <w:szCs w:val="22"/>
-              </w:rPr>
-              <w:t>6</w:t>
-            </w:r>
-            <w:r>
-              <w:rPr>
-                <w:rFonts w:ascii="Arial" w:hAnsi="Arial" w:cs="Arial"/>
-                <w:sz w:val="22"/>
-                <w:szCs w:val="22"/>
-              </w:rPr>
-              <w:t xml:space="preserve"> }}</w:t>
-            </w:r>
-          </w:p>
-        </w:tc>
-        <w:tc>
-          <w:tcPr>
-            <w:tcW w:w="1895" w:type="pct"/>
-            <w:vAlign w:val="center"/>
-          </w:tcPr>
-          <w:p>
-            <w:pPr>
-              <w:pStyle w:val="Prrafodelista"/>
-              <w:ind w:left="0"/>
-              <w:jc w:val="center"/>
-              <w:rPr>
-                <w:rFonts w:ascii="Arial" w:hAnsi="Arial" w:cs="Arial"/>
-                <w:sz w:val="22"/>
-                <w:szCs w:val="22"/>
-              </w:rPr>
-            </w:pPr>
-            <w:r>
-              <w:rPr>
-                <w:rFonts w:ascii="Arial" w:hAnsi="Arial" w:cs="Arial"/>
-                <w:sz w:val="22"/>
-                <w:szCs w:val="22"/>
-              </w:rPr>
-              <w:t>{{ informe.</w:t>
-            </w:r>
-            <w:r>
-              <w:rPr>
-                <w:rFonts w:ascii="Arial" w:hAnsi="Arial" w:cs="Arial"/>
-                <w:sz w:val="22"/>
-                <w:szCs w:val="22"/>
-              </w:rPr>
-              <w:t>monto_6</w:t>
-            </w:r>
-            <w:r>
-              <w:rPr>
-                <w:rFonts w:ascii="Arial" w:hAnsi="Arial" w:cs="Arial"/>
-                <w:sz w:val="22"/>
-                <w:szCs w:val="22"/>
-              </w:rPr>
-              <w:t xml:space="preserve"> }}</w:t>
-            </w:r>
-          </w:p>
-        </w:tc>
-      </w:tr>
-    </w:tbl>
-    <w:p>
-      <w:pPr>
-        <w:jc w:val="both"/>
-        <w:rPr>
-          <w:rFonts w:ascii="Arial" w:hAnsi="Arial" w:cs="Arial"/>
-          <w:sz w:val="22"/>
-          <w:szCs w:val="22"/>
-        </w:rPr>
-      </w:pPr>
-    </w:p>
-    <w:p>
-      <w:pPr>
-        <w:jc w:val="both"/>
-        <w:rPr>
-          <w:rFonts w:ascii="Arial" w:hAnsi="Arial" w:cs="Arial"/>
-          <w:sz w:val="22"/>
-          <w:szCs w:val="22"/>
-        </w:rPr>
-      </w:pPr>
-      <w:r>
-        <w:rPr>
-          <w:rFonts w:ascii="Arial" w:hAnsi="Arial" w:cs="Arial"/>
-          <w:sz w:val="22"/>
-          <w:szCs w:val="22"/>
-        </w:rPr>
-        <w:t>Cumplido ello, y de acuerdo con los protocolos de monitoreo y seguimiento establecidos por el Programa, se verificó la correcta ejecución del financiamiento.</w:t>
-      </w:r>
-    </w:p>
-    <w:p>
-      <w:pPr>
-        <w:jc w:val="both"/>
-        <w:rPr>
-          <w:rFonts w:ascii="Arial" w:hAnsi="Arial" w:cs="Arial"/>
           <w:b/>
         </w:rPr>
       </w:pPr>
@@ -3585,87 +2585,7 @@
           <w:sz w:val="22"/>
           <w:szCs w:val="22"/>
         </w:rPr>
-        <w:t>Co</w:t>
-      </w:r>
-      <w:r>
-        <w:rPr>
-          <w:rFonts w:ascii="Arial" w:hAnsi="Arial" w:cs="Arial"/>
-          <w:sz w:val="22"/>
-          <w:szCs w:val="22"/>
-        </w:rPr>
-        <w:t xml:space="preserve">nforme a la nota de solicitud, </w:t>
-      </w:r>
-      <w:r>
-        <w:rPr>
-          <w:rFonts w:ascii="Arial" w:hAnsi="Arial" w:cs="Arial"/>
-          <w:sz w:val="22"/>
-          <w:szCs w:val="22"/>
-        </w:rPr>
-        <w:t xml:space="preserve">{{ informe.admision.comedor.organizacion.subtipo_entidad }} "{{ informe.nombre_organizacion }}", </w:t>
-      </w:r>
-      <w:r>
-        <w:rPr>
-          <w:rFonts w:ascii="Arial" w:hAnsi="Arial" w:cs="Arial"/>
-          <w:sz w:val="22"/>
-          <w:szCs w:val="22"/>
-        </w:rPr>
-        <w:t>de</w:t>
-      </w:r>
-      <w:r>
-        <w:rPr>
-          <w:rFonts w:ascii="Arial" w:hAnsi="Arial" w:cs="Arial"/>
-          <w:sz w:val="22"/>
-          <w:szCs w:val="22"/>
-        </w:rPr>
-        <w:t xml:space="preserve">clara que el efector </w:t>
-      </w:r>
-      <w:r>
-        <w:rPr>
-          <w:rFonts w:ascii="Arial" w:hAnsi="Arial" w:cs="Arial"/>
-          <w:sz w:val="22"/>
-          <w:szCs w:val="22"/>
-        </w:rPr>
-        <w:t>{{ informe.nombre_espacio }}</w:t>
-      </w:r>
-      <w:r>
-        <w:rPr>
-          <w:rFonts w:ascii="Arial" w:hAnsi="Arial" w:cs="Arial"/>
-          <w:sz w:val="22"/>
-          <w:szCs w:val="22"/>
-        </w:rPr>
-        <w:t xml:space="preserve"> se encuentra ubicado </w:t>
-      </w:r>
-      <w:r>
-        <w:rPr>
-          <w:rFonts w:ascii="Arial" w:hAnsi="Arial" w:cs="Arial"/>
-          <w:sz w:val="22"/>
-          <w:szCs w:val="22"/>
-        </w:rPr>
-        <w:t xml:space="preserve">en </w:t>
-      </w:r>
-      <w:r>
-        <w:rPr>
-          <w:rFonts w:ascii="Arial" w:hAnsi="Arial" w:cs="Arial"/>
-          <w:sz w:val="22"/>
-          <w:szCs w:val="22"/>
-        </w:rPr>
-        <w:t>{{ informe.domicilio_espacio }}</w:t>
-      </w:r>
-      <w:r>
-        <w:rPr>
-          <w:rFonts w:ascii="Arial" w:hAnsi="Arial" w:cs="Arial"/>
-          <w:sz w:val="22"/>
-          <w:szCs w:val="22"/>
-        </w:rPr>
-        <w:t xml:space="preserve">. </w:t>
-      </w:r>
-      <w:r>
-        <w:rPr>
-          <w:rFonts w:ascii="Arial" w:hAnsi="Arial" w:cs="Arial"/>
-          <w:sz w:val="22"/>
-          <w:szCs w:val="22"/>
-        </w:rPr>
-        <w:t>En este marco, la Institución solicita la continuidad del financiamiento, con el objetivo de complementar las siguientes prestaciones alimentarias brindadas:</w:t>
+        <w:t>Conforme a la nota de solicitud, {{ informe.admision.comedor.organizacion.subtipo_entidad }} "{{ informe.nombre_organizacion }}", declara que el efector {{ informe.nombre_espacio }} se encuentra ubicado en {{ informe.domicilio_espacio }}. En este marco, la Institución solicita la continuidad del financiamiento, con el objetivo de complementar las siguientes prestaciones alimentarias brindadas:</w:t>
       </w:r>
     </w:p>
     <w:p>
@@ -3880,48 +2800,9 @@
           <w:sz w:val="22"/>
           <w:szCs w:val="22"/>
         </w:rPr>
-        <w:t>La {{ informe.admision.comedor.organizacion.subtipo</w:t>
-      </w:r>
-      <w:r>
-        <w:rPr>
-          <w:rFonts w:ascii="Arial" w:hAnsi="Arial" w:cs="Arial"/>
-          <w:sz w:val="22"/>
-          <w:szCs w:val="22"/>
-        </w:rPr>
-        <w:t>_entidad</w:t>
-      </w:r>
-      <w:r>
-        <w:rPr>
-          <w:rFonts w:ascii="Arial" w:hAnsi="Arial" w:cs="Arial"/>
-          <w:sz w:val="22"/>
-          <w:szCs w:val="22"/>
-        </w:rPr>
-        <w:t xml:space="preserve"> }} "{{ informe.nombre_organizacion }}" ratifica la voluntad de inscribirse en el Registro Voluntario de </w:t>
-      </w:r>
-      <w:r>
-        <w:rPr>
-          <w:rFonts w:ascii="Arial" w:hAnsi="Arial" w:cs="Arial"/>
-          <w:sz w:val="22"/>
-          <w:szCs w:val="22"/>
-        </w:rPr>
+        <w:t xml:space="preserve">La {{ informe.admision.comedor.organizacion.subtipo_entidad }} "{{ informe.nombre_organizacion }}" ratifica la voluntad de inscribirse en el Registro Voluntario de </w:t>
         <w:lastRenderedPageBreak/>
-        <w:t xml:space="preserve">Simples Asociaciones de la Inspección General de Justicia o en el Registro correspondiente a su Jurisdicción conforme </w:t>
-      </w:r>
-      <w:r>
-        <w:rPr>
-          <w:rFonts w:ascii="Arial" w:hAnsi="Arial" w:cs="Arial"/>
-          <w:sz w:val="22"/>
-          <w:szCs w:val="22"/>
-        </w:rPr>
-        <w:t>{{ informe.nota_gde_if }}</w:t>
-      </w:r>
-      <w:r>
-        <w:rPr>
-          <w:rFonts w:ascii="Arial" w:hAnsi="Arial" w:cs="Arial"/>
-          <w:sz w:val="22"/>
-          <w:szCs w:val="22"/>
-        </w:rPr>
-        <w:t>.</w:t>
+        <w:t>Simples Asociaciones de la Inspección General de Justicia o en el Registro correspondiente a su Jurisdicción conforme {{ informe.nota_gde_if }}.</w:t>
       </w:r>
     </w:p>
     <w:p>
@@ -3937,55 +2818,7 @@
           <w:sz w:val="22"/>
           <w:szCs w:val="22"/>
         </w:rPr>
-        <w:t xml:space="preserve">En lo que refiere al requisito de la presentación de avales, dichas presentaciones fueron oportunamente agregadas en ocasión de su incorporación del </w:t>
-      </w:r>
-      <w:r>
-        <w:rPr>
-          <w:rFonts w:ascii="Arial" w:hAnsi="Arial" w:cs="Arial"/>
-          <w:sz w:val="22"/>
-          <w:szCs w:val="22"/>
-        </w:rPr>
-        <w:t xml:space="preserve">{{ informe.tipo_espacio }} "{{ informe.nombre_espacio }}" </w:t>
-      </w:r>
-      <w:r>
-        <w:rPr>
-          <w:rFonts w:ascii="Arial" w:hAnsi="Arial" w:cs="Arial"/>
-          <w:sz w:val="22"/>
-          <w:szCs w:val="22"/>
-        </w:rPr>
-        <w:t xml:space="preserve">al </w:t>
-      </w:r>
-      <w:r>
-        <w:rPr>
-          <w:rFonts w:ascii="Arial" w:hAnsi="Arial" w:cs="Arial"/>
-          <w:sz w:val="22"/>
-          <w:szCs w:val="22"/>
-        </w:rPr>
-        <w:t>{{ informe.organizacion_avalista_1 }}</w:t>
-      </w:r>
-      <w:r>
-        <w:rPr>
-          <w:rFonts w:ascii="Arial" w:hAnsi="Arial" w:cs="Arial"/>
-          <w:sz w:val="22"/>
-          <w:szCs w:val="22"/>
-        </w:rPr>
-        <w:t xml:space="preserve"> y </w:t>
-      </w:r>
-      <w:r>
-        <w:rPr>
-          <w:rFonts w:ascii="Arial" w:hAnsi="Arial" w:cs="Arial"/>
-          <w:sz w:val="22"/>
-          <w:szCs w:val="22"/>
-        </w:rPr>
-        <w:t>{{</w:t>
-      </w:r>
-      <w:r>
-        <w:rPr>
-          <w:rFonts w:ascii="Arial" w:hAnsi="Arial" w:cs="Arial"/>
-          <w:sz w:val="22"/>
-          <w:szCs w:val="22"/>
-        </w:rPr>
-        <w:t xml:space="preserve"> informe.organizacion_avalista_2</w:t>
+        <w:t>En lo que refiere al requisito de la presentación de avales, dichas presentaciones fueron oportunamente agregadas en ocasión de su incorporación del {{ informe.tipo_espacio }} "{{ informe.nombre_espacio }}" al {{ informe.organizacion_avalista_1 }} y {{ informe.organizacion_avalista_2</w:t>
       </w:r>
       <w:bookmarkStart w:id="0" w:name="_GoBack"/>
       <w:bookmarkEnd w:id="0"/>
@@ -3995,15 +2828,7 @@
           <w:sz w:val="22"/>
           <w:szCs w:val="22"/>
         </w:rPr>
-        <w:t xml:space="preserve"> }}</w:t>
-      </w:r>
-      <w:r>
-        <w:rPr>
-          <w:rFonts w:ascii="Arial" w:hAnsi="Arial" w:cs="Arial"/>
-          <w:sz w:val="22"/>
-          <w:szCs w:val="22"/>
-        </w:rPr>
-        <w:t>.</w:t>
+        <w:t xml:space="preserve"> }}.</w:t>
       </w:r>
     </w:p>
     <w:p>

</xml_diff>